<commit_message>
Added the last models and texture batch. Also added spawns for plates and cups. The tickets now come out of a machine.
</commit_message>
<xml_diff>
--- a/doc/sources.docx
+++ b/doc/sources.docx
@@ -1,6 +1,6 @@
 
 <file path=word/document.xml><?xml version="1.0" encoding="utf-8"?>
-<w:document xmlns:wpc="http://schemas.microsoft.com/office/word/2010/wordprocessingCanvas" xmlns:cx="http://schemas.microsoft.com/office/drawing/2014/chartex" xmlns:cx1="http://schemas.microsoft.com/office/drawing/2015/9/8/chartex" xmlns:cx2="http://schemas.microsoft.com/office/drawing/2015/10/21/chartex" xmlns:cx3="http://schemas.microsoft.com/office/drawing/2016/5/9/chartex" xmlns:cx4="http://schemas.microsoft.com/office/drawing/2016/5/10/chartex" xmlns:cx5="http://schemas.microsoft.com/office/drawing/2016/5/11/chartex" xmlns:cx6="http://schemas.microsoft.com/office/drawing/2016/5/12/chartex" xmlns:cx7="http://schemas.microsoft.com/office/drawing/2016/5/13/chartex" xmlns:cx8="http://schemas.microsoft.com/office/drawing/2016/5/14/chartex" xmlns:mc="http://schemas.openxmlformats.org/markup-compatibility/2006" xmlns:aink="http://schemas.microsoft.com/office/drawing/2016/ink" xmlns:am3d="http://schemas.microsoft.com/office/drawing/2017/model3d" xmlns:o="urn:schemas-microsoft-com:office:office" xmlns:oel="http://schemas.microsoft.com/office/2019/extlst" xmlns:r="http://schemas.openxmlformats.org/officeDocument/2006/relationships" xmlns:m="http://schemas.openxmlformats.org/officeDocument/2006/math" xmlns:v="urn:schemas-microsoft-com:vml" xmlns:wp14="http://schemas.microsoft.com/office/word/2010/wordprocessingDrawing" xmlns:wp="http://schemas.openxmlformats.org/drawingml/2006/wordprocessingDrawing" xmlns:w10="urn:schemas-microsoft-com:office:word" xmlns:w="http://schemas.openxmlformats.org/wordprocessingml/2006/main" xmlns:w14="http://schemas.microsoft.com/office/word/2010/wordml" xmlns:w15="http://schemas.microsoft.com/office/word/2012/wordml" xmlns:w16cex="http://schemas.microsoft.com/office/word/2018/wordml/cex" xmlns:w16cid="http://schemas.microsoft.com/office/word/2016/wordml/cid" xmlns:w16="http://schemas.microsoft.com/office/word/2018/wordml" xmlns:w16sdtdh="http://schemas.microsoft.com/office/word/2020/wordml/sdtdatahash" xmlns:w16se="http://schemas.microsoft.com/office/word/2015/wordml/symex" xmlns:wpg="http://schemas.microsoft.com/office/word/2010/wordprocessingGroup" xmlns:wpi="http://schemas.microsoft.com/office/word/2010/wordprocessingInk" xmlns:wne="http://schemas.microsoft.com/office/word/2006/wordml" xmlns:wps="http://schemas.microsoft.com/office/word/2010/wordprocessingShape" mc:Ignorable="w14 w15 w16se w16cid w16 w16cex w16sdtdh wp14">
+<w:document xmlns:wpc="http://schemas.microsoft.com/office/word/2010/wordprocessingCanvas" xmlns:cx="http://schemas.microsoft.com/office/drawing/2014/chartex" xmlns:cx1="http://schemas.microsoft.com/office/drawing/2015/9/8/chartex" xmlns:cx2="http://schemas.microsoft.com/office/drawing/2015/10/21/chartex" xmlns:cx3="http://schemas.microsoft.com/office/drawing/2016/5/9/chartex" xmlns:cx4="http://schemas.microsoft.com/office/drawing/2016/5/10/chartex" xmlns:cx5="http://schemas.microsoft.com/office/drawing/2016/5/11/chartex" xmlns:cx6="http://schemas.microsoft.com/office/drawing/2016/5/12/chartex" xmlns:cx7="http://schemas.microsoft.com/office/drawing/2016/5/13/chartex" xmlns:cx8="http://schemas.microsoft.com/office/drawing/2016/5/14/chartex" xmlns:mc="http://schemas.openxmlformats.org/markup-compatibility/2006" xmlns:aink="http://schemas.microsoft.com/office/drawing/2016/ink" xmlns:am3d="http://schemas.microsoft.com/office/drawing/2017/model3d" xmlns:o="urn:schemas-microsoft-com:office:office" xmlns:oel="http://schemas.microsoft.com/office/2019/extlst" xmlns:r="http://schemas.openxmlformats.org/officeDocument/2006/relationships" xmlns:m="http://schemas.openxmlformats.org/officeDocument/2006/math" xmlns:v="urn:schemas-microsoft-com:vml" xmlns:wp14="http://schemas.microsoft.com/office/word/2010/wordprocessingDrawing" xmlns:wp="http://schemas.openxmlformats.org/drawingml/2006/wordprocessingDrawing" xmlns:w10="urn:schemas-microsoft-com:office:word" xmlns:w="http://schemas.openxmlformats.org/wordprocessingml/2006/main" xmlns:w14="http://schemas.microsoft.com/office/word/2010/wordml" xmlns:w15="http://schemas.microsoft.com/office/word/2012/wordml" xmlns:w16cex="http://schemas.microsoft.com/office/word/2018/wordml/cex" xmlns:w16cid="http://schemas.microsoft.com/office/word/2016/wordml/cid" xmlns:w16="http://schemas.microsoft.com/office/word/2018/wordml" xmlns:w16du="http://schemas.microsoft.com/office/word/2023/wordml/word16du" xmlns:w16sdtdh="http://schemas.microsoft.com/office/word/2020/wordml/sdtdatahash" xmlns:w16se="http://schemas.microsoft.com/office/word/2015/wordml/symex" xmlns:wpg="http://schemas.microsoft.com/office/word/2010/wordprocessingGroup" xmlns:wpi="http://schemas.microsoft.com/office/word/2010/wordprocessingInk" xmlns:wne="http://schemas.microsoft.com/office/word/2006/wordml" xmlns:wps="http://schemas.microsoft.com/office/word/2010/wordprocessingShape" mc:Ignorable="w14 w15 w16se w16cid w16 w16cex w16sdtdh w16du wp14">
   <w:body>
     <w:p>
       <w:pPr>
@@ -95,13 +95,7 @@
         <w:rPr>
           <w:lang w:val="en-US"/>
         </w:rPr>
-        <w:t xml:space="preserve"> </w:t>
-      </w:r>
-      <w:r>
-        <w:rPr>
-          <w:lang w:val="en-US"/>
-        </w:rPr>
-        <w:t>(last visited 01.11.2023)</w:t>
+        <w:t xml:space="preserve"> (last visited 01.11.2023)</w:t>
       </w:r>
     </w:p>
     <w:p>
@@ -129,13 +123,28 @@
         <w:rPr>
           <w:lang w:val="en-US"/>
         </w:rPr>
-        <w:t xml:space="preserve"> </w:t>
-      </w:r>
-      <w:r>
-        <w:rPr>
-          <w:lang w:val="en-US"/>
-        </w:rPr>
-        <w:t>(last visited 01.11.2023)</w:t>
+        <w:t xml:space="preserve"> (last visited 01.11.2023)</w:t>
+      </w:r>
+    </w:p>
+    <w:p>
+      <w:pPr>
+        <w:rPr>
+          <w:lang w:val="en-US"/>
+        </w:rPr>
+      </w:pPr>
+    </w:p>
+    <w:p>
+      <w:pPr>
+        <w:pStyle w:val="berschrift1"/>
+        <w:rPr>
+          <w:lang w:val="en-US"/>
+        </w:rPr>
+      </w:pPr>
+      <w:r>
+        <w:rPr>
+          <w:lang w:val="en-US"/>
+        </w:rPr>
+        <w:t>Textures:</w:t>
       </w:r>
     </w:p>
     <w:p>
@@ -163,7 +172,7 @@
 </file>
 
 <file path=word/styles.xml><?xml version="1.0" encoding="utf-8"?>
-<w:styles xmlns:mc="http://schemas.openxmlformats.org/markup-compatibility/2006" xmlns:r="http://schemas.openxmlformats.org/officeDocument/2006/relationships" xmlns:w="http://schemas.openxmlformats.org/wordprocessingml/2006/main" xmlns:w14="http://schemas.microsoft.com/office/word/2010/wordml" xmlns:w15="http://schemas.microsoft.com/office/word/2012/wordml" xmlns:w16cex="http://schemas.microsoft.com/office/word/2018/wordml/cex" xmlns:w16cid="http://schemas.microsoft.com/office/word/2016/wordml/cid" xmlns:w16="http://schemas.microsoft.com/office/word/2018/wordml" xmlns:w16sdtdh="http://schemas.microsoft.com/office/word/2020/wordml/sdtdatahash" xmlns:w16se="http://schemas.microsoft.com/office/word/2015/wordml/symex" mc:Ignorable="w14 w15 w16se w16cid w16 w16cex w16sdtdh">
+<w:styles xmlns:mc="http://schemas.openxmlformats.org/markup-compatibility/2006" xmlns:r="http://schemas.openxmlformats.org/officeDocument/2006/relationships" xmlns:w="http://schemas.openxmlformats.org/wordprocessingml/2006/main" xmlns:w14="http://schemas.microsoft.com/office/word/2010/wordml" xmlns:w15="http://schemas.microsoft.com/office/word/2012/wordml" xmlns:w16cex="http://schemas.microsoft.com/office/word/2018/wordml/cex" xmlns:w16cid="http://schemas.microsoft.com/office/word/2016/wordml/cid" xmlns:w16="http://schemas.microsoft.com/office/word/2018/wordml" xmlns:w16du="http://schemas.microsoft.com/office/word/2023/wordml/word16du" xmlns:w16sdtdh="http://schemas.microsoft.com/office/word/2020/wordml/sdtdatahash" xmlns:w16se="http://schemas.microsoft.com/office/word/2015/wordml/symex" mc:Ignorable="w14 w15 w16se w16cid w16 w16cex w16sdtdh w16du">
   <w:docDefaults>
     <w:rPrDefault>
       <w:rPr>
@@ -563,6 +572,27 @@
     <w:name w:val="Normal"/>
     <w:qFormat/>
   </w:style>
+  <w:style w:type="paragraph" w:styleId="berschrift1">
+    <w:name w:val="heading 1"/>
+    <w:basedOn w:val="Standard"/>
+    <w:next w:val="Standard"/>
+    <w:link w:val="berschrift1Zchn"/>
+    <w:uiPriority w:val="9"/>
+    <w:qFormat/>
+    <w:rsid w:val="006D087E"/>
+    <w:pPr>
+      <w:keepNext/>
+      <w:keepLines/>
+      <w:spacing w:before="240" w:after="0"/>
+      <w:outlineLvl w:val="0"/>
+    </w:pPr>
+    <w:rPr>
+      <w:rFonts w:asciiTheme="majorHAnsi" w:eastAsiaTheme="majorEastAsia" w:hAnsiTheme="majorHAnsi" w:cstheme="majorBidi"/>
+      <w:color w:val="2F5496" w:themeColor="accent1" w:themeShade="BF"/>
+      <w:sz w:val="32"/>
+      <w:szCs w:val="32"/>
+    </w:rPr>
+  </w:style>
   <w:style w:type="character" w:default="1" w:styleId="Absatz-Standardschriftart">
     <w:name w:val="Default Paragraph Font"/>
     <w:uiPriority w:val="1"/>
@@ -611,6 +641,19 @@
     <w:rPr>
       <w:color w:val="605E5C"/>
       <w:shd w:val="clear" w:color="auto" w:fill="E1DFDD"/>
+    </w:rPr>
+  </w:style>
+  <w:style w:type="character" w:customStyle="1" w:styleId="berschrift1Zchn">
+    <w:name w:val="Überschrift 1 Zchn"/>
+    <w:basedOn w:val="Absatz-Standardschriftart"/>
+    <w:link w:val="berschrift1"/>
+    <w:uiPriority w:val="9"/>
+    <w:rsid w:val="006D087E"/>
+    <w:rPr>
+      <w:rFonts w:asciiTheme="majorHAnsi" w:eastAsiaTheme="majorEastAsia" w:hAnsiTheme="majorHAnsi" w:cstheme="majorBidi"/>
+      <w:color w:val="2F5496" w:themeColor="accent1" w:themeShade="BF"/>
+      <w:sz w:val="32"/>
+      <w:szCs w:val="32"/>
     </w:rPr>
   </w:style>
 </w:styles>

</xml_diff>

<commit_message>
Added lots of textures and models
</commit_message>
<xml_diff>
--- a/doc/sources.docx
+++ b/doc/sources.docx
@@ -1,6 +1,6 @@
 
 <file path=word/document.xml><?xml version="1.0" encoding="utf-8"?>
-<w:document xmlns:wpc="http://schemas.microsoft.com/office/word/2010/wordprocessingCanvas" xmlns:cx="http://schemas.microsoft.com/office/drawing/2014/chartex" xmlns:cx1="http://schemas.microsoft.com/office/drawing/2015/9/8/chartex" xmlns:cx2="http://schemas.microsoft.com/office/drawing/2015/10/21/chartex" xmlns:cx3="http://schemas.microsoft.com/office/drawing/2016/5/9/chartex" xmlns:cx4="http://schemas.microsoft.com/office/drawing/2016/5/10/chartex" xmlns:cx5="http://schemas.microsoft.com/office/drawing/2016/5/11/chartex" xmlns:cx6="http://schemas.microsoft.com/office/drawing/2016/5/12/chartex" xmlns:cx7="http://schemas.microsoft.com/office/drawing/2016/5/13/chartex" xmlns:cx8="http://schemas.microsoft.com/office/drawing/2016/5/14/chartex" xmlns:mc="http://schemas.openxmlformats.org/markup-compatibility/2006" xmlns:aink="http://schemas.microsoft.com/office/drawing/2016/ink" xmlns:am3d="http://schemas.microsoft.com/office/drawing/2017/model3d" xmlns:o="urn:schemas-microsoft-com:office:office" xmlns:oel="http://schemas.microsoft.com/office/2019/extlst" xmlns:r="http://schemas.openxmlformats.org/officeDocument/2006/relationships" xmlns:m="http://schemas.openxmlformats.org/officeDocument/2006/math" xmlns:v="urn:schemas-microsoft-com:vml" xmlns:wp14="http://schemas.microsoft.com/office/word/2010/wordprocessingDrawing" xmlns:wp="http://schemas.openxmlformats.org/drawingml/2006/wordprocessingDrawing" xmlns:w10="urn:schemas-microsoft-com:office:word" xmlns:w="http://schemas.openxmlformats.org/wordprocessingml/2006/main" xmlns:w14="http://schemas.microsoft.com/office/word/2010/wordml" xmlns:w15="http://schemas.microsoft.com/office/word/2012/wordml" xmlns:w16cex="http://schemas.microsoft.com/office/word/2018/wordml/cex" xmlns:w16cid="http://schemas.microsoft.com/office/word/2016/wordml/cid" xmlns:w16="http://schemas.microsoft.com/office/word/2018/wordml" xmlns:w16sdtdh="http://schemas.microsoft.com/office/word/2020/wordml/sdtdatahash" xmlns:w16se="http://schemas.microsoft.com/office/word/2015/wordml/symex" xmlns:wpg="http://schemas.microsoft.com/office/word/2010/wordprocessingGroup" xmlns:wpi="http://schemas.microsoft.com/office/word/2010/wordprocessingInk" xmlns:wne="http://schemas.microsoft.com/office/word/2006/wordml" xmlns:wps="http://schemas.microsoft.com/office/word/2010/wordprocessingShape" mc:Ignorable="w14 w15 w16se w16cid w16 w16cex w16sdtdh wp14">
+<w:document xmlns:wpc="http://schemas.microsoft.com/office/word/2010/wordprocessingCanvas" xmlns:cx="http://schemas.microsoft.com/office/drawing/2014/chartex" xmlns:cx1="http://schemas.microsoft.com/office/drawing/2015/9/8/chartex" xmlns:cx2="http://schemas.microsoft.com/office/drawing/2015/10/21/chartex" xmlns:cx3="http://schemas.microsoft.com/office/drawing/2016/5/9/chartex" xmlns:cx4="http://schemas.microsoft.com/office/drawing/2016/5/10/chartex" xmlns:cx5="http://schemas.microsoft.com/office/drawing/2016/5/11/chartex" xmlns:cx6="http://schemas.microsoft.com/office/drawing/2016/5/12/chartex" xmlns:cx7="http://schemas.microsoft.com/office/drawing/2016/5/13/chartex" xmlns:cx8="http://schemas.microsoft.com/office/drawing/2016/5/14/chartex" xmlns:mc="http://schemas.openxmlformats.org/markup-compatibility/2006" xmlns:aink="http://schemas.microsoft.com/office/drawing/2016/ink" xmlns:am3d="http://schemas.microsoft.com/office/drawing/2017/model3d" xmlns:o="urn:schemas-microsoft-com:office:office" xmlns:oel="http://schemas.microsoft.com/office/2019/extlst" xmlns:r="http://schemas.openxmlformats.org/officeDocument/2006/relationships" xmlns:m="http://schemas.openxmlformats.org/officeDocument/2006/math" xmlns:v="urn:schemas-microsoft-com:vml" xmlns:wp14="http://schemas.microsoft.com/office/word/2010/wordprocessingDrawing" xmlns:wp="http://schemas.openxmlformats.org/drawingml/2006/wordprocessingDrawing" xmlns:w10="urn:schemas-microsoft-com:office:word" xmlns:w="http://schemas.openxmlformats.org/wordprocessingml/2006/main" xmlns:w14="http://schemas.microsoft.com/office/word/2010/wordml" xmlns:w15="http://schemas.microsoft.com/office/word/2012/wordml" xmlns:w16cex="http://schemas.microsoft.com/office/word/2018/wordml/cex" xmlns:w16cid="http://schemas.microsoft.com/office/word/2016/wordml/cid" xmlns:w16="http://schemas.microsoft.com/office/word/2018/wordml" xmlns:w16du="http://schemas.microsoft.com/office/word/2023/wordml/word16du" xmlns:w16sdtdh="http://schemas.microsoft.com/office/word/2020/wordml/sdtdatahash" xmlns:w16se="http://schemas.microsoft.com/office/word/2015/wordml/symex" xmlns:wpg="http://schemas.microsoft.com/office/word/2010/wordprocessingGroup" xmlns:wpi="http://schemas.microsoft.com/office/word/2010/wordprocessingInk" xmlns:wne="http://schemas.microsoft.com/office/word/2006/wordml" xmlns:wps="http://schemas.microsoft.com/office/word/2010/wordprocessingShape" mc:Ignorable="w14 w15 w16se w16cid w16 w16cex w16sdtdh w16du wp14">
   <w:body>
     <w:p>
       <w:pPr>
@@ -95,13 +95,7 @@
         <w:rPr>
           <w:lang w:val="en-US"/>
         </w:rPr>
-        <w:t xml:space="preserve"> </w:t>
-      </w:r>
-      <w:r>
-        <w:rPr>
-          <w:lang w:val="en-US"/>
-        </w:rPr>
-        <w:t>(last visited 01.11.2023)</w:t>
+        <w:t xml:space="preserve"> (last visited 01.11.2023)</w:t>
       </w:r>
     </w:p>
     <w:p>
@@ -129,13 +123,28 @@
         <w:rPr>
           <w:lang w:val="en-US"/>
         </w:rPr>
-        <w:t xml:space="preserve"> </w:t>
-      </w:r>
-      <w:r>
-        <w:rPr>
-          <w:lang w:val="en-US"/>
-        </w:rPr>
-        <w:t>(last visited 01.11.2023)</w:t>
+        <w:t xml:space="preserve"> (last visited 01.11.2023)</w:t>
+      </w:r>
+    </w:p>
+    <w:p>
+      <w:pPr>
+        <w:rPr>
+          <w:lang w:val="en-US"/>
+        </w:rPr>
+      </w:pPr>
+    </w:p>
+    <w:p>
+      <w:pPr>
+        <w:pStyle w:val="berschrift1"/>
+        <w:rPr>
+          <w:lang w:val="en-US"/>
+        </w:rPr>
+      </w:pPr>
+      <w:r>
+        <w:rPr>
+          <w:lang w:val="en-US"/>
+        </w:rPr>
+        <w:t>Textures:</w:t>
       </w:r>
     </w:p>
     <w:p>
@@ -163,7 +172,7 @@
 </file>
 
 <file path=word/styles.xml><?xml version="1.0" encoding="utf-8"?>
-<w:styles xmlns:mc="http://schemas.openxmlformats.org/markup-compatibility/2006" xmlns:r="http://schemas.openxmlformats.org/officeDocument/2006/relationships" xmlns:w="http://schemas.openxmlformats.org/wordprocessingml/2006/main" xmlns:w14="http://schemas.microsoft.com/office/word/2010/wordml" xmlns:w15="http://schemas.microsoft.com/office/word/2012/wordml" xmlns:w16cex="http://schemas.microsoft.com/office/word/2018/wordml/cex" xmlns:w16cid="http://schemas.microsoft.com/office/word/2016/wordml/cid" xmlns:w16="http://schemas.microsoft.com/office/word/2018/wordml" xmlns:w16sdtdh="http://schemas.microsoft.com/office/word/2020/wordml/sdtdatahash" xmlns:w16se="http://schemas.microsoft.com/office/word/2015/wordml/symex" mc:Ignorable="w14 w15 w16se w16cid w16 w16cex w16sdtdh">
+<w:styles xmlns:mc="http://schemas.openxmlformats.org/markup-compatibility/2006" xmlns:r="http://schemas.openxmlformats.org/officeDocument/2006/relationships" xmlns:w="http://schemas.openxmlformats.org/wordprocessingml/2006/main" xmlns:w14="http://schemas.microsoft.com/office/word/2010/wordml" xmlns:w15="http://schemas.microsoft.com/office/word/2012/wordml" xmlns:w16cex="http://schemas.microsoft.com/office/word/2018/wordml/cex" xmlns:w16cid="http://schemas.microsoft.com/office/word/2016/wordml/cid" xmlns:w16="http://schemas.microsoft.com/office/word/2018/wordml" xmlns:w16du="http://schemas.microsoft.com/office/word/2023/wordml/word16du" xmlns:w16sdtdh="http://schemas.microsoft.com/office/word/2020/wordml/sdtdatahash" xmlns:w16se="http://schemas.microsoft.com/office/word/2015/wordml/symex" mc:Ignorable="w14 w15 w16se w16cid w16 w16cex w16sdtdh w16du">
   <w:docDefaults>
     <w:rPrDefault>
       <w:rPr>
@@ -563,6 +572,27 @@
     <w:name w:val="Normal"/>
     <w:qFormat/>
   </w:style>
+  <w:style w:type="paragraph" w:styleId="berschrift1">
+    <w:name w:val="heading 1"/>
+    <w:basedOn w:val="Standard"/>
+    <w:next w:val="Standard"/>
+    <w:link w:val="berschrift1Zchn"/>
+    <w:uiPriority w:val="9"/>
+    <w:qFormat/>
+    <w:rsid w:val="006D087E"/>
+    <w:pPr>
+      <w:keepNext/>
+      <w:keepLines/>
+      <w:spacing w:before="240" w:after="0"/>
+      <w:outlineLvl w:val="0"/>
+    </w:pPr>
+    <w:rPr>
+      <w:rFonts w:asciiTheme="majorHAnsi" w:eastAsiaTheme="majorEastAsia" w:hAnsiTheme="majorHAnsi" w:cstheme="majorBidi"/>
+      <w:color w:val="2F5496" w:themeColor="accent1" w:themeShade="BF"/>
+      <w:sz w:val="32"/>
+      <w:szCs w:val="32"/>
+    </w:rPr>
+  </w:style>
   <w:style w:type="character" w:default="1" w:styleId="Absatz-Standardschriftart">
     <w:name w:val="Default Paragraph Font"/>
     <w:uiPriority w:val="1"/>
@@ -611,6 +641,19 @@
     <w:rPr>
       <w:color w:val="605E5C"/>
       <w:shd w:val="clear" w:color="auto" w:fill="E1DFDD"/>
+    </w:rPr>
+  </w:style>
+  <w:style w:type="character" w:customStyle="1" w:styleId="berschrift1Zchn">
+    <w:name w:val="Überschrift 1 Zchn"/>
+    <w:basedOn w:val="Absatz-Standardschriftart"/>
+    <w:link w:val="berschrift1"/>
+    <w:uiPriority w:val="9"/>
+    <w:rsid w:val="006D087E"/>
+    <w:rPr>
+      <w:rFonts w:asciiTheme="majorHAnsi" w:eastAsiaTheme="majorEastAsia" w:hAnsiTheme="majorHAnsi" w:cstheme="majorBidi"/>
+      <w:color w:val="2F5496" w:themeColor="accent1" w:themeShade="BF"/>
+      <w:sz w:val="32"/>
+      <w:szCs w:val="32"/>
     </w:rPr>
   </w:style>
 </w:styles>

</xml_diff>

<commit_message>
Fixed the fridge positioning and movement
</commit_message>
<xml_diff>
--- a/doc/sources.docx
+++ b/doc/sources.docx
@@ -14,7 +14,7 @@
         </w:rPr>
         <w:t xml:space="preserve">3D OpenGL Tutorial Series in Java: </w:t>
       </w:r>
-      <w:hyperlink r:id="rId4" w:history="1">
+      <w:hyperlink r:id="rId5" w:history="1">
         <w:r>
           <w:rPr>
             <w:rStyle w:val="Hyperlink"/>
@@ -54,7 +54,7 @@
         </w:rPr>
         <w:t xml:space="preserve">OpenGL Water Tutorial: </w:t>
       </w:r>
-      <w:hyperlink r:id="rId5" w:history="1">
+      <w:hyperlink r:id="rId6" w:history="1">
         <w:r>
           <w:rPr>
             <w:rStyle w:val="Hyperlink"/>
@@ -82,7 +82,7 @@
         </w:rPr>
         <w:t xml:space="preserve">Collision Detection: </w:t>
       </w:r>
-      <w:hyperlink r:id="rId6" w:history="1">
+      <w:hyperlink r:id="rId7" w:history="1">
         <w:r>
           <w:rPr>
             <w:rStyle w:val="Hyperlink"/>
@@ -110,7 +110,7 @@
         </w:rPr>
         <w:t xml:space="preserve">Sweep And Prune Algorithm: </w:t>
       </w:r>
-      <w:hyperlink r:id="rId7" w:history="1">
+      <w:hyperlink r:id="rId8" w:history="1">
         <w:r>
           <w:rPr>
             <w:rStyle w:val="Hyperlink"/>
@@ -153,11 +153,2676 @@
           <w:lang w:val="en-US"/>
         </w:rPr>
       </w:pPr>
-    </w:p>
-    <w:p>
-      <w:pPr>
-        <w:rPr>
-          <w:lang w:val="en-US"/>
+      <w:r>
+        <w:rPr>
+          <w:lang w:val="en-US"/>
+        </w:rPr>
+        <w:t>Pictures used to create own textures:</w:t>
+      </w:r>
+    </w:p>
+    <w:p>
+      <w:pPr>
+        <w:pStyle w:val="Listenabsatz"/>
+        <w:numPr>
+          <w:ilvl w:val="0"/>
+          <w:numId w:val="1"/>
+        </w:numPr>
+        <w:rPr>
+          <w:lang w:val="en-US"/>
+        </w:rPr>
+      </w:pPr>
+      <w:r>
+        <w:rPr>
+          <w:lang w:val="en-US"/>
+        </w:rPr>
+        <w:t xml:space="preserve">Beer Logo: </w:t>
+      </w:r>
+      <w:hyperlink r:id="rId9" w:history="1">
+        <w:r>
+          <w:rPr>
+            <w:rStyle w:val="Hyperlink"/>
+            <w:lang w:val="en-US"/>
+          </w:rPr>
+          <w:t>https://media.licdn.com/dms/image/D4D05AQGv3eiMVZz_gQ/videocover-low/0/1709890397507?e=2147483647&amp;v=beta&amp;t=GwArKdMZs4P-c6pD9YOl7B-IBSnLfR_x0cdhgN4TxyM</w:t>
+        </w:r>
+      </w:hyperlink>
+      <w:r>
+        <w:rPr>
+          <w:lang w:val="en-US"/>
+        </w:rPr>
+        <w:t xml:space="preserve"> </w:t>
+      </w:r>
+    </w:p>
+    <w:p>
+      <w:pPr>
+        <w:pStyle w:val="Listenabsatz"/>
+        <w:numPr>
+          <w:ilvl w:val="0"/>
+          <w:numId w:val="1"/>
+        </w:numPr>
+        <w:rPr>
+          <w:lang w:val="en-US"/>
+        </w:rPr>
+      </w:pPr>
+      <w:proofErr w:type="spellStart"/>
+      <w:r>
+        <w:rPr>
+          <w:lang w:val="en-US"/>
+        </w:rPr>
+        <w:t>Ovomaltine</w:t>
+      </w:r>
+      <w:proofErr w:type="spellEnd"/>
+      <w:r>
+        <w:rPr>
+          <w:lang w:val="en-US"/>
+        </w:rPr>
+        <w:t xml:space="preserve">: </w:t>
+      </w:r>
+      <w:hyperlink r:id="rId10" w:history="1">
+        <w:r>
+          <w:rPr>
+            <w:rStyle w:val="Hyperlink"/>
+            <w:lang w:val="en-US"/>
+          </w:rPr>
+          <w:t>https://www.ovomaltine.ch/produkte/ovomaltine-pulver-10-x-15g</w:t>
+        </w:r>
+      </w:hyperlink>
+    </w:p>
+    <w:p>
+      <w:pPr>
+        <w:pStyle w:val="Listenabsatz"/>
+        <w:numPr>
+          <w:ilvl w:val="0"/>
+          <w:numId w:val="1"/>
+        </w:numPr>
+        <w:rPr>
+          <w:lang w:val="en-US"/>
+        </w:rPr>
+      </w:pPr>
+      <w:r>
+        <w:rPr>
+          <w:lang w:val="en-US"/>
+        </w:rPr>
+        <w:t xml:space="preserve">Sprite: </w:t>
+      </w:r>
+      <w:hyperlink r:id="rId11" w:history="1">
+        <w:r>
+          <w:rPr>
+            <w:rStyle w:val="Hyperlink"/>
+            <w:lang w:val="en-US"/>
+          </w:rPr>
+          <w:t>https://www.satoriz-saintetienne.shop/wp-content/uploads/1707/83/170738331358788_0-600x600.png</w:t>
+        </w:r>
+      </w:hyperlink>
+    </w:p>
+    <w:p>
+      <w:pPr>
+        <w:pStyle w:val="Listenabsatz"/>
+        <w:numPr>
+          <w:ilvl w:val="0"/>
+          <w:numId w:val="1"/>
+        </w:numPr>
+        <w:rPr>
+          <w:lang w:val="en-US"/>
+        </w:rPr>
+      </w:pPr>
+      <w:r>
+        <w:rPr>
+          <w:lang w:val="en-US"/>
+        </w:rPr>
+        <w:t xml:space="preserve">Coffee Beans: </w:t>
+      </w:r>
+      <w:hyperlink r:id="rId12" w:history="1">
+        <w:r>
+          <w:rPr>
+            <w:rStyle w:val="Hyperlink"/>
+            <w:lang w:val="en-US"/>
+          </w:rPr>
+          <w:t>https://victorallen.com/cdn/shop/articles/vicor-allen-coffee-beans-bulk-request-1.jpg?v=1572039618</w:t>
+        </w:r>
+      </w:hyperlink>
+    </w:p>
+    <w:p>
+      <w:pPr>
+        <w:pStyle w:val="Listenabsatz"/>
+        <w:numPr>
+          <w:ilvl w:val="0"/>
+          <w:numId w:val="1"/>
+        </w:numPr>
+        <w:rPr>
+          <w:lang w:val="en-US"/>
+        </w:rPr>
+      </w:pPr>
+      <w:r>
+        <w:rPr>
+          <w:lang w:val="en-US"/>
+        </w:rPr>
+        <w:t xml:space="preserve">Cartoon Bean: </w:t>
+      </w:r>
+      <w:hyperlink r:id="rId13" w:history="1">
+        <w:r>
+          <w:rPr>
+            <w:rStyle w:val="Hyperlink"/>
+            <w:lang w:val="en-US"/>
+          </w:rPr>
+          <w:t>https://encrypted-tbn1.gstatic.com/images?q=tbn:ANd9GcS4Yp-nbO8T05RrSnPanjIYUnQB-66DwFMePcl-7joIOr81J1vE</w:t>
+        </w:r>
+      </w:hyperlink>
+    </w:p>
+    <w:p>
+      <w:pPr>
+        <w:pStyle w:val="Listenabsatz"/>
+        <w:numPr>
+          <w:ilvl w:val="0"/>
+          <w:numId w:val="1"/>
+        </w:numPr>
+        <w:rPr>
+          <w:lang w:val="en-US"/>
+        </w:rPr>
+      </w:pPr>
+      <w:r>
+        <w:rPr>
+          <w:lang w:val="en-US"/>
+        </w:rPr>
+        <w:t xml:space="preserve">Birch Wood: </w:t>
+      </w:r>
+      <w:hyperlink r:id="rId14" w:history="1">
+        <w:r>
+          <w:rPr>
+            <w:rStyle w:val="Hyperlink"/>
+            <w:lang w:val="en-US"/>
+          </w:rPr>
+          <w:t>https://encrypted-tbn3.gstatic.com/images?q=tbn:ANd9GcQ62mxx-7hlFJOK-7bGuk3E54wuKVlC7m85-xniH5V1vWMQIkl0</w:t>
+        </w:r>
+      </w:hyperlink>
+    </w:p>
+    <w:p>
+      <w:pPr>
+        <w:pStyle w:val="Listenabsatz"/>
+        <w:numPr>
+          <w:ilvl w:val="0"/>
+          <w:numId w:val="1"/>
+        </w:numPr>
+        <w:rPr>
+          <w:lang w:val="en-US"/>
+        </w:rPr>
+      </w:pPr>
+      <w:r>
+        <w:rPr>
+          <w:lang w:val="en-US"/>
+        </w:rPr>
+        <w:t xml:space="preserve">Black Metal: </w:t>
+      </w:r>
+      <w:hyperlink r:id="rId15" w:history="1">
+        <w:r>
+          <w:rPr>
+            <w:rStyle w:val="Hyperlink"/>
+            <w:lang w:val="en-US"/>
+          </w:rPr>
+          <w:t>https://encrypted-tbn0.gstatic.com/images?q=tbn:ANd9GcTHliKBA0qiviaW52UEZmG6J9OHUTEP1eO_a1-e-P-aU0EL8OGx</w:t>
+        </w:r>
+      </w:hyperlink>
+    </w:p>
+    <w:p>
+      <w:pPr>
+        <w:pStyle w:val="Listenabsatz"/>
+        <w:numPr>
+          <w:ilvl w:val="0"/>
+          <w:numId w:val="1"/>
+        </w:numPr>
+        <w:rPr>
+          <w:lang w:val="en-US"/>
+        </w:rPr>
+      </w:pPr>
+      <w:r>
+        <w:rPr>
+          <w:lang w:val="en-US"/>
+        </w:rPr>
+        <w:t xml:space="preserve">Black Plastic: </w:t>
+      </w:r>
+      <w:hyperlink r:id="rId16" w:history="1">
+        <w:r>
+          <w:rPr>
+            <w:rStyle w:val="Hyperlink"/>
+            <w:lang w:val="en-US"/>
+          </w:rPr>
+          <w:t>https://encrypted-tbn1.gstatic.com/images?q=tbn:ANd9GcR8lziSML6-zhAhdLTgxVDQMLYp7wEMFRG66w33hklOzZRidj-D</w:t>
+        </w:r>
+      </w:hyperlink>
+    </w:p>
+    <w:p>
+      <w:pPr>
+        <w:pStyle w:val="Listenabsatz"/>
+        <w:numPr>
+          <w:ilvl w:val="0"/>
+          <w:numId w:val="1"/>
+        </w:numPr>
+        <w:rPr>
+          <w:lang w:val="en-US"/>
+        </w:rPr>
+      </w:pPr>
+      <w:r>
+        <w:rPr>
+          <w:lang w:val="en-US"/>
+        </w:rPr>
+        <w:t xml:space="preserve">Black Plastic 2: </w:t>
+      </w:r>
+      <w:hyperlink r:id="rId17" w:history="1">
+        <w:r>
+          <w:rPr>
+            <w:rStyle w:val="Hyperlink"/>
+            <w:lang w:val="en-US"/>
+          </w:rPr>
+          <w:t>https://stock.adobe.com/de/images/black-plastic-texture-background-dark-rough-material-in-pvc-object/225281244</w:t>
+        </w:r>
+      </w:hyperlink>
+    </w:p>
+    <w:p>
+      <w:pPr>
+        <w:pStyle w:val="Listenabsatz"/>
+        <w:numPr>
+          <w:ilvl w:val="0"/>
+          <w:numId w:val="1"/>
+        </w:numPr>
+        <w:rPr>
+          <w:lang w:val="en-US"/>
+        </w:rPr>
+      </w:pPr>
+      <w:proofErr w:type="spellStart"/>
+      <w:r>
+        <w:rPr>
+          <w:lang w:val="en-US"/>
+        </w:rPr>
+        <w:t>Caotina</w:t>
+      </w:r>
+      <w:proofErr w:type="spellEnd"/>
+      <w:r>
+        <w:rPr>
+          <w:lang w:val="en-US"/>
+        </w:rPr>
+        <w:t xml:space="preserve">: </w:t>
+      </w:r>
+      <w:hyperlink r:id="rId18" w:history="1">
+        <w:r>
+          <w:rPr>
+            <w:rStyle w:val="Hyperlink"/>
+            <w:lang w:val="en-US"/>
+          </w:rPr>
+          <w:t>https://www.coop.ch/de/lebensmittel/getraenke/heisse-getraenke/schokolade/caotina-original/p/3031994</w:t>
+        </w:r>
+      </w:hyperlink>
+    </w:p>
+    <w:p>
+      <w:pPr>
+        <w:pStyle w:val="Listenabsatz"/>
+        <w:numPr>
+          <w:ilvl w:val="0"/>
+          <w:numId w:val="1"/>
+        </w:numPr>
+        <w:rPr>
+          <w:lang w:val="en-US"/>
+        </w:rPr>
+      </w:pPr>
+      <w:r>
+        <w:rPr>
+          <w:lang w:val="en-US"/>
+        </w:rPr>
+        <w:t xml:space="preserve">Ceramic: </w:t>
+      </w:r>
+      <w:hyperlink r:id="rId19" w:history="1">
+        <w:r>
+          <w:rPr>
+            <w:rStyle w:val="Hyperlink"/>
+            <w:lang w:val="en-US"/>
+          </w:rPr>
+          <w:t>https://depositphotos.com/photo/texture-of-handmade-ceramic-plate-63727413.html</w:t>
+        </w:r>
+      </w:hyperlink>
+    </w:p>
+    <w:p>
+      <w:pPr>
+        <w:pStyle w:val="Listenabsatz"/>
+        <w:numPr>
+          <w:ilvl w:val="0"/>
+          <w:numId w:val="1"/>
+        </w:numPr>
+        <w:rPr>
+          <w:lang w:val="fr-CH"/>
+        </w:rPr>
+      </w:pPr>
+      <w:proofErr w:type="gramStart"/>
+      <w:r>
+        <w:rPr>
+          <w:lang w:val="fr-CH"/>
+        </w:rPr>
+        <w:t>Chai:</w:t>
+      </w:r>
+      <w:proofErr w:type="gramEnd"/>
+      <w:r>
+        <w:rPr>
+          <w:lang w:val="fr-CH"/>
+        </w:rPr>
+        <w:t xml:space="preserve"> </w:t>
+      </w:r>
+      <w:hyperlink r:id="rId20" w:history="1">
+        <w:r>
+          <w:rPr>
+            <w:rStyle w:val="Hyperlink"/>
+            <w:lang w:val="fr-CH"/>
+          </w:rPr>
+          <w:t>https://encrypted-tbn1.gstatic.com/images?q=tbn:ANd9GcRa3qUnrxyekkKBwdqhf6MnagVI1QyKOP7aaJ9lQvyIvIBmcykM</w:t>
+        </w:r>
+      </w:hyperlink>
+    </w:p>
+    <w:p>
+      <w:pPr>
+        <w:pStyle w:val="Listenabsatz"/>
+        <w:numPr>
+          <w:ilvl w:val="0"/>
+          <w:numId w:val="1"/>
+        </w:numPr>
+      </w:pPr>
+      <w:r>
+        <w:t xml:space="preserve">Leder: </w:t>
+      </w:r>
+      <w:hyperlink r:id="rId21" w:history="1">
+        <w:r>
+          <w:rPr>
+            <w:rStyle w:val="Hyperlink"/>
+          </w:rPr>
+          <w:t>https://www.hartmann-tresore.ch/de/tresore/id-safes/</w:t>
+        </w:r>
+      </w:hyperlink>
+    </w:p>
+    <w:p>
+      <w:pPr>
+        <w:pStyle w:val="Listenabsatz"/>
+        <w:numPr>
+          <w:ilvl w:val="0"/>
+          <w:numId w:val="1"/>
+        </w:numPr>
+        <w:rPr>
+          <w:lang w:val="en-US"/>
+        </w:rPr>
+      </w:pPr>
+      <w:r>
+        <w:rPr>
+          <w:lang w:val="en-US"/>
+        </w:rPr>
+        <w:t xml:space="preserve">White Plastic: </w:t>
+      </w:r>
+      <w:hyperlink r:id="rId22" w:history="1">
+        <w:r>
+          <w:rPr>
+            <w:rStyle w:val="Hyperlink"/>
+            <w:lang w:val="en-US"/>
+          </w:rPr>
+          <w:t>https://www.istockphoto.com/de/foto/textur-von-gl%C3%A4nzendem-silber-bar-abstrakten-hintergrund-gm1071748712-286809008?searchscope=image%2Cfilm</w:t>
+        </w:r>
+      </w:hyperlink>
+    </w:p>
+    <w:p>
+      <w:pPr>
+        <w:pStyle w:val="Listenabsatz"/>
+        <w:numPr>
+          <w:ilvl w:val="0"/>
+          <w:numId w:val="1"/>
+        </w:numPr>
+      </w:pPr>
+      <w:r>
+        <w:t xml:space="preserve">Coke Zero: </w:t>
+      </w:r>
+      <w:hyperlink r:id="rId23" w:history="1">
+        <w:r>
+          <w:rPr>
+            <w:rStyle w:val="Hyperlink"/>
+          </w:rPr>
+          <w:t>https://www.aldi.lu/de/produkte/a-marken/coca-cola-zero-6057-1-0.article.html</w:t>
+        </w:r>
+      </w:hyperlink>
+    </w:p>
+    <w:p>
+      <w:pPr>
+        <w:pStyle w:val="Listenabsatz"/>
+        <w:numPr>
+          <w:ilvl w:val="0"/>
+          <w:numId w:val="1"/>
+        </w:numPr>
+        <w:rPr>
+          <w:lang w:val="en-US"/>
+        </w:rPr>
+      </w:pPr>
+      <w:r>
+        <w:rPr>
+          <w:lang w:val="en-US"/>
+        </w:rPr>
+        <w:t xml:space="preserve">Coke Logo: </w:t>
+      </w:r>
+      <w:hyperlink r:id="rId24" w:history="1">
+        <w:r>
+          <w:rPr>
+            <w:rStyle w:val="Hyperlink"/>
+            <w:lang w:val="en-US"/>
+          </w:rPr>
+          <w:t>https://de.vecteezy.com/vektorkunst/64047-coca-cola-logo</w:t>
+        </w:r>
+      </w:hyperlink>
+    </w:p>
+    <w:p>
+      <w:pPr>
+        <w:pStyle w:val="Listenabsatz"/>
+        <w:numPr>
+          <w:ilvl w:val="0"/>
+          <w:numId w:val="1"/>
+        </w:numPr>
+        <w:rPr>
+          <w:lang w:val="en-US"/>
+        </w:rPr>
+      </w:pPr>
+      <w:r>
+        <w:rPr>
+          <w:lang w:val="en-US"/>
+        </w:rPr>
+        <w:t xml:space="preserve">Confirm: </w:t>
+      </w:r>
+      <w:hyperlink r:id="rId25" w:history="1">
+        <w:r>
+          <w:rPr>
+            <w:rStyle w:val="Hyperlink"/>
+            <w:lang w:val="en-US"/>
+          </w:rPr>
+          <w:t>https://de.cleanpng.com/png-pwst3g/</w:t>
+        </w:r>
+      </w:hyperlink>
+    </w:p>
+    <w:p>
+      <w:pPr>
+        <w:pStyle w:val="Listenabsatz"/>
+        <w:numPr>
+          <w:ilvl w:val="0"/>
+          <w:numId w:val="1"/>
+        </w:numPr>
+        <w:rPr>
+          <w:lang w:val="en-US"/>
+        </w:rPr>
+      </w:pPr>
+      <w:r>
+        <w:rPr>
+          <w:lang w:val="en-US"/>
+        </w:rPr>
+        <w:t xml:space="preserve">Dark Wood: </w:t>
+      </w:r>
+      <w:hyperlink r:id="rId26" w:history="1">
+        <w:r>
+          <w:rPr>
+            <w:rStyle w:val="Hyperlink"/>
+            <w:lang w:val="en-US"/>
+          </w:rPr>
+          <w:t>https://www.creativefabrica.com/de/product/wood-texture-61/</w:t>
+        </w:r>
+      </w:hyperlink>
+    </w:p>
+    <w:p>
+      <w:pPr>
+        <w:pStyle w:val="Listenabsatz"/>
+        <w:numPr>
+          <w:ilvl w:val="0"/>
+          <w:numId w:val="1"/>
+        </w:numPr>
+      </w:pPr>
+      <w:r>
+        <w:t xml:space="preserve">Erdbeertörtchen: </w:t>
+      </w:r>
+      <w:hyperlink r:id="rId27" w:history="1">
+        <w:r>
+          <w:rPr>
+            <w:rStyle w:val="Hyperlink"/>
+          </w:rPr>
+          <w:t>https://www.spruengli.ch/de/shop/patisserie-dessert/erdbeer-toertli.html</w:t>
+        </w:r>
+      </w:hyperlink>
+    </w:p>
+    <w:p>
+      <w:pPr>
+        <w:pStyle w:val="Listenabsatz"/>
+        <w:numPr>
+          <w:ilvl w:val="0"/>
+          <w:numId w:val="1"/>
+        </w:numPr>
+      </w:pPr>
+      <w:r>
+        <w:lastRenderedPageBreak/>
+        <w:t xml:space="preserve">Folie: </w:t>
+      </w:r>
+      <w:hyperlink r:id="rId28" w:history="1">
+        <w:r>
+          <w:rPr>
+            <w:rStyle w:val="Hyperlink"/>
+          </w:rPr>
+          <w:t>https://www.textures4photoshop.com/tex/metal/aluminium-wrinkle-foil-texture-free.aspx</w:t>
+        </w:r>
+      </w:hyperlink>
+    </w:p>
+    <w:p>
+      <w:pPr>
+        <w:pStyle w:val="Listenabsatz"/>
+        <w:numPr>
+          <w:ilvl w:val="0"/>
+          <w:numId w:val="1"/>
+        </w:numPr>
+        <w:rPr>
+          <w:lang w:val="en-US"/>
+        </w:rPr>
+      </w:pPr>
+      <w:r>
+        <w:rPr>
+          <w:lang w:val="en-US"/>
+        </w:rPr>
+        <w:t xml:space="preserve">Glass: </w:t>
+      </w:r>
+      <w:hyperlink r:id="rId29" w:history="1">
+        <w:r>
+          <w:rPr>
+            <w:rStyle w:val="Hyperlink"/>
+            <w:lang w:val="en-US"/>
+          </w:rPr>
+          <w:t>https://stock.adobe.com/de/images/blue-glass-texture-background/63041718</w:t>
+        </w:r>
+      </w:hyperlink>
+    </w:p>
+    <w:p>
+      <w:pPr>
+        <w:pStyle w:val="Listenabsatz"/>
+        <w:numPr>
+          <w:ilvl w:val="0"/>
+          <w:numId w:val="1"/>
+        </w:numPr>
+        <w:rPr>
+          <w:lang w:val="en-US"/>
+        </w:rPr>
+      </w:pPr>
+      <w:r>
+        <w:rPr>
+          <w:lang w:val="en-US"/>
+        </w:rPr>
+        <w:t xml:space="preserve">Green Leather: </w:t>
+      </w:r>
+      <w:hyperlink r:id="rId30" w:history="1">
+        <w:r>
+          <w:rPr>
+            <w:rStyle w:val="Hyperlink"/>
+            <w:lang w:val="en-US"/>
+          </w:rPr>
+          <w:t>https://depositphotos.com/photo/green-leather-texture-46565835.html</w:t>
+        </w:r>
+      </w:hyperlink>
+    </w:p>
+    <w:p>
+      <w:pPr>
+        <w:pStyle w:val="Listenabsatz"/>
+        <w:numPr>
+          <w:ilvl w:val="0"/>
+          <w:numId w:val="1"/>
+        </w:numPr>
+        <w:rPr>
+          <w:lang w:val="en-US"/>
+        </w:rPr>
+      </w:pPr>
+      <w:r>
+        <w:rPr>
+          <w:lang w:val="en-US"/>
+        </w:rPr>
+        <w:t xml:space="preserve">Grey Wall: </w:t>
+      </w:r>
+      <w:hyperlink r:id="rId31" w:history="1">
+        <w:r>
+          <w:rPr>
+            <w:rStyle w:val="Hyperlink"/>
+            <w:lang w:val="en-US"/>
+          </w:rPr>
+          <w:t>https://www.pinterest.com/pin/gray-wall-texture--563864815828123969/</w:t>
+        </w:r>
+      </w:hyperlink>
+    </w:p>
+    <w:p>
+      <w:pPr>
+        <w:pStyle w:val="Listenabsatz"/>
+        <w:numPr>
+          <w:ilvl w:val="0"/>
+          <w:numId w:val="1"/>
+        </w:numPr>
+        <w:rPr>
+          <w:lang w:val="en-US"/>
+        </w:rPr>
+      </w:pPr>
+      <w:r>
+        <w:rPr>
+          <w:lang w:val="en-US"/>
+        </w:rPr>
+        <w:t xml:space="preserve">Metal Holes: </w:t>
+      </w:r>
+      <w:hyperlink r:id="rId32" w:history="1">
+        <w:r>
+          <w:rPr>
+            <w:rStyle w:val="Hyperlink"/>
+            <w:lang w:val="en-US"/>
+          </w:rPr>
+          <w:t>https://www.etsy.com/ch/listing/704639285/harfenmetallplattenmuster-bedrucktes</w:t>
+        </w:r>
+      </w:hyperlink>
+    </w:p>
+    <w:p>
+      <w:pPr>
+        <w:pStyle w:val="Listenabsatz"/>
+        <w:numPr>
+          <w:ilvl w:val="0"/>
+          <w:numId w:val="1"/>
+        </w:numPr>
+        <w:rPr>
+          <w:lang w:val="fr-CH"/>
+        </w:rPr>
+      </w:pPr>
+      <w:proofErr w:type="gramStart"/>
+      <w:r>
+        <w:rPr>
+          <w:lang w:val="fr-CH"/>
+        </w:rPr>
+        <w:t>Ice:</w:t>
+      </w:r>
+      <w:proofErr w:type="gramEnd"/>
+      <w:r>
+        <w:rPr>
+          <w:lang w:val="fr-CH"/>
+        </w:rPr>
+        <w:t xml:space="preserve"> </w:t>
+      </w:r>
+      <w:hyperlink r:id="rId33" w:history="1">
+        <w:r>
+          <w:rPr>
+            <w:rStyle w:val="Hyperlink"/>
+            <w:lang w:val="fr-CH"/>
+          </w:rPr>
+          <w:t>https://www.colourbox.de/bild/eis-durchsichtig-wetter-bild-14434407</w:t>
+        </w:r>
+      </w:hyperlink>
+    </w:p>
+    <w:p>
+      <w:pPr>
+        <w:pStyle w:val="Listenabsatz"/>
+        <w:numPr>
+          <w:ilvl w:val="0"/>
+          <w:numId w:val="1"/>
+        </w:numPr>
+        <w:rPr>
+          <w:lang w:val="en-US"/>
+        </w:rPr>
+      </w:pPr>
+      <w:r>
+        <w:rPr>
+          <w:lang w:val="en-US"/>
+        </w:rPr>
+        <w:t xml:space="preserve">Lactose Free Milk: </w:t>
+      </w:r>
+      <w:hyperlink r:id="rId34" w:history="1">
+        <w:r>
+          <w:rPr>
+            <w:rStyle w:val="Hyperlink"/>
+            <w:lang w:val="en-US"/>
+          </w:rPr>
+          <w:t>https://www.coop.ch/de/lebensmittel/milchprodukte-eier/milch/spezialmilch/emmi-good-day-milchgetraenk-15-milchfett-pasteurisiert-laktosefrei/p/4473043</w:t>
+        </w:r>
+      </w:hyperlink>
+    </w:p>
+    <w:p>
+      <w:pPr>
+        <w:pStyle w:val="Listenabsatz"/>
+        <w:numPr>
+          <w:ilvl w:val="0"/>
+          <w:numId w:val="1"/>
+        </w:numPr>
+        <w:rPr>
+          <w:lang w:val="fr-CH"/>
+        </w:rPr>
+      </w:pPr>
+      <w:proofErr w:type="spellStart"/>
+      <w:proofErr w:type="gramStart"/>
+      <w:r>
+        <w:rPr>
+          <w:lang w:val="fr-CH"/>
+        </w:rPr>
+        <w:t>Lemons</w:t>
+      </w:r>
+      <w:proofErr w:type="spellEnd"/>
+      <w:r>
+        <w:rPr>
+          <w:lang w:val="fr-CH"/>
+        </w:rPr>
+        <w:t>:</w:t>
+      </w:r>
+      <w:proofErr w:type="gramEnd"/>
+      <w:r>
+        <w:rPr>
+          <w:lang w:val="fr-CH"/>
+        </w:rPr>
+        <w:t xml:space="preserve"> </w:t>
+      </w:r>
+      <w:hyperlink r:id="rId35" w:history="1">
+        <w:r>
+          <w:rPr>
+            <w:rStyle w:val="Hyperlink"/>
+            <w:lang w:val="fr-CH"/>
+          </w:rPr>
+          <w:t>https://pikbest.com/backgrounds/lemon-slice-patterned-texture-background-with-yellow-slices_9933737.html</w:t>
+        </w:r>
+      </w:hyperlink>
+    </w:p>
+    <w:p>
+      <w:pPr>
+        <w:pStyle w:val="Listenabsatz"/>
+        <w:numPr>
+          <w:ilvl w:val="0"/>
+          <w:numId w:val="1"/>
+        </w:numPr>
+        <w:rPr>
+          <w:lang w:val="fr-CH"/>
+        </w:rPr>
+      </w:pPr>
+      <w:proofErr w:type="spellStart"/>
+      <w:proofErr w:type="gramStart"/>
+      <w:r>
+        <w:rPr>
+          <w:lang w:val="fr-CH"/>
+        </w:rPr>
+        <w:t>Porcelain</w:t>
+      </w:r>
+      <w:proofErr w:type="spellEnd"/>
+      <w:r>
+        <w:rPr>
+          <w:lang w:val="fr-CH"/>
+        </w:rPr>
+        <w:t>:</w:t>
+      </w:r>
+      <w:proofErr w:type="gramEnd"/>
+      <w:r>
+        <w:rPr>
+          <w:lang w:val="fr-CH"/>
+        </w:rPr>
+        <w:t xml:space="preserve"> </w:t>
+      </w:r>
+      <w:hyperlink r:id="rId36" w:history="1">
+        <w:r>
+          <w:rPr>
+            <w:rStyle w:val="Hyperlink"/>
+            <w:lang w:val="fr-CH"/>
+          </w:rPr>
+          <w:t>https://terrazzo-fliesen.com/granito-tech.php</w:t>
+        </w:r>
+      </w:hyperlink>
+    </w:p>
+    <w:p>
+      <w:pPr>
+        <w:pStyle w:val="Listenabsatz"/>
+        <w:numPr>
+          <w:ilvl w:val="0"/>
+          <w:numId w:val="1"/>
+        </w:numPr>
+        <w:rPr>
+          <w:lang w:val="en-US"/>
+        </w:rPr>
+      </w:pPr>
+      <w:r>
+        <w:rPr>
+          <w:lang w:val="en-US"/>
+        </w:rPr>
+        <w:t xml:space="preserve">White </w:t>
+      </w:r>
+      <w:proofErr w:type="gramStart"/>
+      <w:r>
+        <w:rPr>
+          <w:lang w:val="en-US"/>
+        </w:rPr>
+        <w:t>Wall :</w:t>
+      </w:r>
+      <w:proofErr w:type="gramEnd"/>
+      <w:r>
+        <w:rPr>
+          <w:lang w:val="en-US"/>
+        </w:rPr>
+        <w:t xml:space="preserve"> </w:t>
+      </w:r>
+      <w:hyperlink r:id="rId37" w:history="1">
+        <w:r>
+          <w:rPr>
+            <w:rStyle w:val="Hyperlink"/>
+            <w:lang w:val="en-US"/>
+          </w:rPr>
+          <w:t>https://www.pinterest.de/pin/295267319318264598/</w:t>
+        </w:r>
+      </w:hyperlink>
+    </w:p>
+    <w:p>
+      <w:pPr>
+        <w:pStyle w:val="Listenabsatz"/>
+        <w:numPr>
+          <w:ilvl w:val="0"/>
+          <w:numId w:val="1"/>
+        </w:numPr>
+        <w:rPr>
+          <w:lang w:val="en-US"/>
+        </w:rPr>
+      </w:pPr>
+      <w:r>
+        <w:rPr>
+          <w:lang w:val="en-US"/>
+        </w:rPr>
+        <w:t xml:space="preserve">White Wall 2: </w:t>
+      </w:r>
+      <w:hyperlink r:id="rId38" w:history="1">
+        <w:r>
+          <w:rPr>
+            <w:rStyle w:val="Hyperlink"/>
+            <w:lang w:val="en-US"/>
+          </w:rPr>
+          <w:t>https://stock.adobe.com/de/images/white-plaster-wall-texture-seamless-repeatable-texture-background/297098515</w:t>
+        </w:r>
+      </w:hyperlink>
+      <w:r>
+        <w:rPr>
+          <w:lang w:val="en-US"/>
+        </w:rPr>
+        <w:t xml:space="preserve"> </w:t>
+      </w:r>
+    </w:p>
+    <w:p>
+      <w:pPr>
+        <w:pStyle w:val="Listenabsatz"/>
+        <w:numPr>
+          <w:ilvl w:val="0"/>
+          <w:numId w:val="1"/>
+        </w:numPr>
+        <w:rPr>
+          <w:lang w:val="en-US"/>
+        </w:rPr>
+      </w:pPr>
+      <w:r>
+        <w:rPr>
+          <w:lang w:val="en-US"/>
+        </w:rPr>
+        <w:t xml:space="preserve">Tea Texture: </w:t>
+      </w:r>
+      <w:hyperlink r:id="rId39" w:history="1">
+        <w:r>
+          <w:rPr>
+            <w:rStyle w:val="Hyperlink"/>
+            <w:lang w:val="en-US"/>
+          </w:rPr>
+          <w:t>https://depositphotos.com/vector/seamless-pattern-with-teapot-cup-saucer-muffins-floral-elements-and-ladybug-romantic-flower-background-blue-94438048.html</w:t>
+        </w:r>
+      </w:hyperlink>
+    </w:p>
+    <w:p>
+      <w:pPr>
+        <w:pStyle w:val="Listenabsatz"/>
+        <w:numPr>
+          <w:ilvl w:val="0"/>
+          <w:numId w:val="1"/>
+        </w:numPr>
+        <w:rPr>
+          <w:lang w:val="en-US"/>
+        </w:rPr>
+      </w:pPr>
+      <w:r>
+        <w:rPr>
+          <w:lang w:val="en-US"/>
+        </w:rPr>
+        <w:t xml:space="preserve">Dark Wood 2: </w:t>
+      </w:r>
+      <w:hyperlink r:id="rId40" w:history="1">
+        <w:r>
+          <w:rPr>
+            <w:rStyle w:val="Hyperlink"/>
+            <w:lang w:val="en-US"/>
+          </w:rPr>
+          <w:t>https://stock.adobe.com/de/images/seamless-wood-texture-background-tileable-rustic-redwood-hardwood-floor-planks-illustration-render-perfect-for-flatlays-and-backdrops/493697962</w:t>
+        </w:r>
+      </w:hyperlink>
+    </w:p>
+    <w:p>
+      <w:pPr>
+        <w:pStyle w:val="Listenabsatz"/>
+        <w:numPr>
+          <w:ilvl w:val="0"/>
+          <w:numId w:val="1"/>
+        </w:numPr>
+        <w:rPr>
+          <w:lang w:val="en-US"/>
+        </w:rPr>
+      </w:pPr>
+      <w:r>
+        <w:rPr>
+          <w:lang w:val="en-US"/>
+        </w:rPr>
+        <w:t xml:space="preserve">Wood: </w:t>
+      </w:r>
+      <w:hyperlink r:id="rId41" w:history="1">
+        <w:r>
+          <w:rPr>
+            <w:rStyle w:val="Hyperlink"/>
+            <w:lang w:val="en-US"/>
+          </w:rPr>
+          <w:t>https://www.pexels.com/de-de/foto/braunes-parkett-172276/</w:t>
+        </w:r>
+      </w:hyperlink>
+    </w:p>
+    <w:p>
+      <w:pPr>
+        <w:pStyle w:val="Listenabsatz"/>
+        <w:numPr>
+          <w:ilvl w:val="0"/>
+          <w:numId w:val="1"/>
+        </w:numPr>
+      </w:pPr>
+      <w:proofErr w:type="spellStart"/>
+      <w:r>
+        <w:t>Sausage</w:t>
+      </w:r>
+      <w:proofErr w:type="spellEnd"/>
+      <w:r>
+        <w:t xml:space="preserve">: </w:t>
+      </w:r>
+      <w:hyperlink r:id="rId42" w:history="1">
+        <w:r>
+          <w:rPr>
+            <w:rStyle w:val="Hyperlink"/>
+          </w:rPr>
+          <w:t>https://www.mpip-mainz.mpg.de/de/presse/pm-2022-07?c=369488</w:t>
+        </w:r>
+      </w:hyperlink>
+    </w:p>
+    <w:p>
+      <w:pPr>
+        <w:pStyle w:val="Listenabsatz"/>
+        <w:numPr>
+          <w:ilvl w:val="0"/>
+          <w:numId w:val="1"/>
+        </w:numPr>
+      </w:pPr>
+      <w:proofErr w:type="spellStart"/>
+      <w:r>
+        <w:t>Receipt</w:t>
+      </w:r>
+      <w:proofErr w:type="spellEnd"/>
+      <w:r>
+        <w:t xml:space="preserve"> </w:t>
+      </w:r>
+      <w:proofErr w:type="spellStart"/>
+      <w:r>
+        <w:t>Machine</w:t>
+      </w:r>
+      <w:proofErr w:type="spellEnd"/>
+      <w:r>
+        <w:t xml:space="preserve">: </w:t>
+      </w:r>
+      <w:hyperlink r:id="rId43" w:history="1">
+        <w:r>
+          <w:rPr>
+            <w:rStyle w:val="Hyperlink"/>
+          </w:rPr>
+          <w:t>https://www.alternate.ch/Epson/TM-T20III-Bondrucker/html/product/1592300</w:t>
+        </w:r>
+      </w:hyperlink>
+    </w:p>
+    <w:p>
+      <w:pPr>
+        <w:pStyle w:val="Listenabsatz"/>
+        <w:numPr>
+          <w:ilvl w:val="0"/>
+          <w:numId w:val="1"/>
+        </w:numPr>
+        <w:rPr>
+          <w:lang w:val="fr-CH"/>
+        </w:rPr>
+      </w:pPr>
+      <w:proofErr w:type="spellStart"/>
+      <w:proofErr w:type="gramStart"/>
+      <w:r>
+        <w:rPr>
+          <w:lang w:val="fr-CH"/>
+        </w:rPr>
+        <w:t>Mandelcroissant</w:t>
+      </w:r>
+      <w:proofErr w:type="spellEnd"/>
+      <w:r>
+        <w:rPr>
+          <w:lang w:val="fr-CH"/>
+        </w:rPr>
+        <w:t>:</w:t>
+      </w:r>
+      <w:proofErr w:type="gramEnd"/>
+      <w:r>
+        <w:rPr>
+          <w:lang w:val="fr-CH"/>
+        </w:rPr>
+        <w:t xml:space="preserve"> </w:t>
+      </w:r>
+      <w:hyperlink r:id="rId44" w:history="1">
+        <w:r>
+          <w:rPr>
+            <w:rStyle w:val="Hyperlink"/>
+            <w:lang w:val="fr-CH"/>
+          </w:rPr>
+          <w:t>https://jetzerbegg.ch/shop/neuheiten/croissant-mandel/</w:t>
+        </w:r>
+      </w:hyperlink>
+    </w:p>
+    <w:p>
+      <w:pPr>
+        <w:pStyle w:val="Listenabsatz"/>
+        <w:numPr>
+          <w:ilvl w:val="0"/>
+          <w:numId w:val="1"/>
+        </w:numPr>
+        <w:rPr>
+          <w:lang w:val="fr-CH"/>
+        </w:rPr>
+      </w:pPr>
+      <w:proofErr w:type="spellStart"/>
+      <w:r>
+        <w:rPr>
+          <w:lang w:val="fr-CH"/>
+        </w:rPr>
+        <w:t>Accept</w:t>
+      </w:r>
+      <w:proofErr w:type="spellEnd"/>
+      <w:r>
+        <w:rPr>
+          <w:lang w:val="fr-CH"/>
+        </w:rPr>
+        <w:t xml:space="preserve"> : </w:t>
+      </w:r>
+      <w:hyperlink r:id="rId45" w:history="1">
+        <w:r>
+          <w:rPr>
+            <w:rStyle w:val="Hyperlink"/>
+            <w:lang w:val="fr-CH"/>
+          </w:rPr>
+          <w:t>https://icon-icons.com/de/symbol/ok-akzeptieren/2961</w:t>
+        </w:r>
+      </w:hyperlink>
+    </w:p>
+    <w:p>
+      <w:pPr>
+        <w:pStyle w:val="Listenabsatz"/>
+        <w:numPr>
+          <w:ilvl w:val="0"/>
+          <w:numId w:val="1"/>
+        </w:numPr>
+        <w:rPr>
+          <w:lang w:val="fr-CH"/>
+        </w:rPr>
+      </w:pPr>
+      <w:proofErr w:type="spellStart"/>
+      <w:r>
+        <w:rPr>
+          <w:lang w:val="fr-CH"/>
+        </w:rPr>
+        <w:t>Bubbles</w:t>
+      </w:r>
+      <w:proofErr w:type="spellEnd"/>
+      <w:r>
+        <w:rPr>
+          <w:lang w:val="fr-CH"/>
+        </w:rPr>
+        <w:t xml:space="preserve"> : </w:t>
+      </w:r>
+      <w:hyperlink r:id="rId46" w:history="1">
+        <w:r>
+          <w:rPr>
+            <w:rStyle w:val="Hyperlink"/>
+            <w:lang w:val="fr-CH"/>
+          </w:rPr>
+          <w:t>https://stock.adobe.com/de/images/water-bubbles-set-png-isolated-translucent-cosmetic-aqua-realistic-blue-bubbles-with-reflection/558339198?asset_id=558339198</w:t>
+        </w:r>
+      </w:hyperlink>
+    </w:p>
+    <w:p>
+      <w:pPr>
+        <w:pStyle w:val="Listenabsatz"/>
+        <w:numPr>
+          <w:ilvl w:val="0"/>
+          <w:numId w:val="1"/>
+        </w:numPr>
+        <w:rPr>
+          <w:lang w:val="en-US"/>
+        </w:rPr>
+      </w:pPr>
+      <w:proofErr w:type="spellStart"/>
+      <w:r>
+        <w:rPr>
+          <w:lang w:val="en-US"/>
+        </w:rPr>
+        <w:t>Caotina</w:t>
+      </w:r>
+      <w:proofErr w:type="spellEnd"/>
+      <w:r>
+        <w:rPr>
+          <w:lang w:val="en-US"/>
+        </w:rPr>
+        <w:t xml:space="preserve"> </w:t>
+      </w:r>
+      <w:proofErr w:type="gramStart"/>
+      <w:r>
+        <w:rPr>
+          <w:lang w:val="en-US"/>
+        </w:rPr>
+        <w:t>2 :</w:t>
+      </w:r>
+      <w:proofErr w:type="gramEnd"/>
+      <w:r>
+        <w:rPr>
+          <w:lang w:val="en-US"/>
+        </w:rPr>
+        <w:t xml:space="preserve"> </w:t>
+      </w:r>
+      <w:hyperlink r:id="rId47" w:history="1">
+        <w:r>
+          <w:rPr>
+            <w:rStyle w:val="Hyperlink"/>
+            <w:lang w:val="en-US"/>
+          </w:rPr>
+          <w:t>https://www.caotina.ch/produkte/caotina-original-400g</w:t>
+        </w:r>
+      </w:hyperlink>
+    </w:p>
+    <w:p>
+      <w:pPr>
+        <w:pStyle w:val="Listenabsatz"/>
+        <w:numPr>
+          <w:ilvl w:val="0"/>
+          <w:numId w:val="1"/>
+        </w:numPr>
+        <w:rPr>
+          <w:lang w:val="fr-CH"/>
+        </w:rPr>
+      </w:pPr>
+      <w:proofErr w:type="spellStart"/>
+      <w:proofErr w:type="gramStart"/>
+      <w:r>
+        <w:rPr>
+          <w:lang w:val="fr-CH"/>
+        </w:rPr>
+        <w:t>Carac</w:t>
+      </w:r>
+      <w:proofErr w:type="spellEnd"/>
+      <w:r>
+        <w:rPr>
+          <w:lang w:val="fr-CH"/>
+        </w:rPr>
+        <w:t>:</w:t>
+      </w:r>
+      <w:proofErr w:type="gramEnd"/>
+      <w:r>
+        <w:rPr>
+          <w:lang w:val="fr-CH"/>
+        </w:rPr>
+        <w:t xml:space="preserve"> </w:t>
+      </w:r>
+      <w:hyperlink r:id="rId48" w:history="1">
+        <w:r>
+          <w:rPr>
+            <w:rStyle w:val="Hyperlink"/>
+            <w:lang w:val="fr-CH"/>
+          </w:rPr>
+          <w:t>https://jetzerbegg.ch/shop/suessgebaeck/carac/</w:t>
+        </w:r>
+      </w:hyperlink>
+    </w:p>
+    <w:p>
+      <w:pPr>
+        <w:pStyle w:val="Listenabsatz"/>
+        <w:numPr>
+          <w:ilvl w:val="0"/>
+          <w:numId w:val="1"/>
+        </w:numPr>
+        <w:rPr>
+          <w:lang w:val="en-US"/>
+        </w:rPr>
+      </w:pPr>
+      <w:r>
+        <w:rPr>
+          <w:lang w:val="en-US"/>
+        </w:rPr>
+        <w:t xml:space="preserve">Carrot </w:t>
+      </w:r>
+      <w:proofErr w:type="gramStart"/>
+      <w:r>
+        <w:rPr>
+          <w:lang w:val="en-US"/>
+        </w:rPr>
+        <w:t>Cake :</w:t>
+      </w:r>
+      <w:proofErr w:type="gramEnd"/>
+      <w:r>
+        <w:rPr>
+          <w:lang w:val="en-US"/>
+        </w:rPr>
+        <w:t xml:space="preserve"> </w:t>
+      </w:r>
+      <w:hyperlink r:id="rId49" w:history="1">
+        <w:r>
+          <w:rPr>
+            <w:rStyle w:val="Hyperlink"/>
+            <w:lang w:val="en-US"/>
+          </w:rPr>
+          <w:t>https://jetzerbegg.ch/shop/torten/torte-rueebli-urdinkelmehl/</w:t>
+        </w:r>
+      </w:hyperlink>
+    </w:p>
+    <w:p>
+      <w:pPr>
+        <w:pStyle w:val="Listenabsatz"/>
+        <w:numPr>
+          <w:ilvl w:val="0"/>
+          <w:numId w:val="1"/>
+        </w:numPr>
+        <w:rPr>
+          <w:lang w:val="fr-CH"/>
+        </w:rPr>
+      </w:pPr>
+      <w:proofErr w:type="spellStart"/>
+      <w:r>
+        <w:rPr>
+          <w:lang w:val="fr-CH"/>
+        </w:rPr>
+        <w:t>Champagner</w:t>
+      </w:r>
+      <w:proofErr w:type="spellEnd"/>
+      <w:r>
+        <w:rPr>
+          <w:lang w:val="fr-CH"/>
+        </w:rPr>
+        <w:t xml:space="preserve"> </w:t>
+      </w:r>
+      <w:proofErr w:type="gramStart"/>
+      <w:r>
+        <w:rPr>
+          <w:lang w:val="fr-CH"/>
+        </w:rPr>
+        <w:t>Glas:</w:t>
+      </w:r>
+      <w:proofErr w:type="gramEnd"/>
+      <w:r>
+        <w:rPr>
+          <w:lang w:val="fr-CH"/>
+        </w:rPr>
+        <w:t xml:space="preserve"> </w:t>
+      </w:r>
+      <w:hyperlink r:id="rId50" w:history="1">
+        <w:r>
+          <w:rPr>
+            <w:rStyle w:val="Hyperlink"/>
+            <w:lang w:val="fr-CH"/>
+          </w:rPr>
+          <w:t>https://www.intergastro.ch/marken/schott-zwiesel/vina-schott-zwiesel/</w:t>
+        </w:r>
+      </w:hyperlink>
+    </w:p>
+    <w:p>
+      <w:pPr>
+        <w:pStyle w:val="Listenabsatz"/>
+        <w:numPr>
+          <w:ilvl w:val="0"/>
+          <w:numId w:val="1"/>
+        </w:numPr>
+        <w:rPr>
+          <w:lang w:val="fr-CH"/>
+        </w:rPr>
+      </w:pPr>
+      <w:proofErr w:type="spellStart"/>
+      <w:r>
+        <w:rPr>
+          <w:lang w:val="fr-CH"/>
+        </w:rPr>
+        <w:t>Chocolate</w:t>
+      </w:r>
+      <w:proofErr w:type="spellEnd"/>
+      <w:r>
+        <w:rPr>
+          <w:lang w:val="fr-CH"/>
+        </w:rPr>
+        <w:t xml:space="preserve"> Croissant : </w:t>
+      </w:r>
+      <w:hyperlink r:id="rId51" w:history="1">
+        <w:r>
+          <w:rPr>
+            <w:rStyle w:val="Hyperlink"/>
+            <w:lang w:val="fr-CH"/>
+          </w:rPr>
+          <w:t>https://jetzerbegg.ch/shop/neuheiten/croissant-chocolat/</w:t>
+        </w:r>
+      </w:hyperlink>
+    </w:p>
+    <w:p>
+      <w:pPr>
+        <w:pStyle w:val="Listenabsatz"/>
+        <w:numPr>
+          <w:ilvl w:val="0"/>
+          <w:numId w:val="1"/>
+        </w:numPr>
+        <w:rPr>
+          <w:lang w:val="en-US"/>
+        </w:rPr>
+      </w:pPr>
+      <w:r>
+        <w:rPr>
+          <w:lang w:val="en-US"/>
+        </w:rPr>
+        <w:t xml:space="preserve">Chocolate </w:t>
+      </w:r>
+      <w:proofErr w:type="gramStart"/>
+      <w:r>
+        <w:rPr>
+          <w:lang w:val="en-US"/>
+        </w:rPr>
+        <w:t>Cake :</w:t>
+      </w:r>
+      <w:proofErr w:type="gramEnd"/>
+      <w:r>
+        <w:rPr>
+          <w:lang w:val="en-US"/>
+        </w:rPr>
+        <w:t xml:space="preserve"> </w:t>
+      </w:r>
+      <w:hyperlink r:id="rId52" w:history="1">
+        <w:r>
+          <w:rPr>
+            <w:rStyle w:val="Hyperlink"/>
+            <w:lang w:val="en-US"/>
+          </w:rPr>
+          <w:t>https://jetzerbegg.ch/shop/torten/torte-schokomousse/</w:t>
+        </w:r>
+      </w:hyperlink>
+    </w:p>
+    <w:p>
+      <w:pPr>
+        <w:pStyle w:val="Listenabsatz"/>
+        <w:numPr>
+          <w:ilvl w:val="0"/>
+          <w:numId w:val="1"/>
+        </w:numPr>
+        <w:rPr>
+          <w:lang w:val="en-US"/>
+        </w:rPr>
+      </w:pPr>
+      <w:proofErr w:type="spellStart"/>
+      <w:r>
+        <w:rPr>
+          <w:lang w:val="en-US"/>
+        </w:rPr>
+        <w:t>Chocolatl</w:t>
+      </w:r>
+      <w:proofErr w:type="spellEnd"/>
+      <w:r>
+        <w:rPr>
+          <w:lang w:val="en-US"/>
+        </w:rPr>
+        <w:t xml:space="preserve">: </w:t>
+      </w:r>
+      <w:hyperlink r:id="rId53" w:history="1">
+        <w:r>
+          <w:rPr>
+            <w:rStyle w:val="Hyperlink"/>
+            <w:lang w:val="en-US"/>
+          </w:rPr>
+          <w:t>https://harbor-herbalist.square.site/product/chocolatl/11?cs=true&amp;cst=custom</w:t>
+        </w:r>
+      </w:hyperlink>
+    </w:p>
+    <w:p>
+      <w:pPr>
+        <w:pStyle w:val="Listenabsatz"/>
+        <w:numPr>
+          <w:ilvl w:val="0"/>
+          <w:numId w:val="1"/>
+        </w:numPr>
+        <w:rPr>
+          <w:lang w:val="en-US"/>
+        </w:rPr>
+      </w:pPr>
+      <w:r>
+        <w:rPr>
+          <w:lang w:val="en-US"/>
+        </w:rPr>
+        <w:t xml:space="preserve">Lemon Cake: </w:t>
+      </w:r>
+      <w:hyperlink r:id="rId54" w:history="1">
+        <w:r>
+          <w:rPr>
+            <w:rStyle w:val="Hyperlink"/>
+            <w:lang w:val="en-US"/>
+          </w:rPr>
+          <w:t>https://jetzerbegg.ch/shop/torten/torte-zitrone-brombeer/</w:t>
+        </w:r>
+      </w:hyperlink>
+    </w:p>
+    <w:p>
+      <w:pPr>
+        <w:pStyle w:val="Listenabsatz"/>
+        <w:numPr>
+          <w:ilvl w:val="0"/>
+          <w:numId w:val="1"/>
+        </w:numPr>
+        <w:rPr>
+          <w:lang w:val="en-US"/>
+        </w:rPr>
+      </w:pPr>
+      <w:r>
+        <w:rPr>
+          <w:lang w:val="en-US"/>
+        </w:rPr>
+        <w:t xml:space="preserve">Cookie: </w:t>
+      </w:r>
+      <w:hyperlink r:id="rId55" w:history="1">
+        <w:r>
+          <w:rPr>
+            <w:rStyle w:val="Hyperlink"/>
+            <w:lang w:val="en-US"/>
+          </w:rPr>
+          <w:t>https://jetzerbegg.ch/shop/suessgebaeck/urdinkel-cookie/</w:t>
+        </w:r>
+      </w:hyperlink>
+    </w:p>
+    <w:p>
+      <w:pPr>
+        <w:pStyle w:val="Listenabsatz"/>
+        <w:numPr>
+          <w:ilvl w:val="0"/>
+          <w:numId w:val="1"/>
+        </w:numPr>
+        <w:rPr>
+          <w:lang w:val="fr-CH"/>
+        </w:rPr>
+      </w:pPr>
+      <w:proofErr w:type="gramStart"/>
+      <w:r>
+        <w:rPr>
+          <w:lang w:val="fr-CH"/>
+        </w:rPr>
+        <w:t>Croissant:</w:t>
+      </w:r>
+      <w:proofErr w:type="gramEnd"/>
+      <w:r>
+        <w:rPr>
+          <w:lang w:val="fr-CH"/>
+        </w:rPr>
+        <w:t xml:space="preserve"> </w:t>
+      </w:r>
+      <w:hyperlink r:id="rId56" w:history="1">
+        <w:r>
+          <w:rPr>
+            <w:rStyle w:val="Hyperlink"/>
+            <w:lang w:val="fr-CH"/>
+          </w:rPr>
+          <w:t>https://jetzerbegg.ch/shop/weggli/buttergipfel/</w:t>
+        </w:r>
+      </w:hyperlink>
+    </w:p>
+    <w:p>
+      <w:pPr>
+        <w:pStyle w:val="Listenabsatz"/>
+        <w:numPr>
+          <w:ilvl w:val="0"/>
+          <w:numId w:val="1"/>
+        </w:numPr>
+        <w:rPr>
+          <w:lang w:val="en-US"/>
+        </w:rPr>
+      </w:pPr>
+      <w:r>
+        <w:rPr>
+          <w:lang w:val="en-US"/>
+        </w:rPr>
+        <w:t xml:space="preserve">Earl </w:t>
+      </w:r>
+      <w:proofErr w:type="gramStart"/>
+      <w:r>
+        <w:rPr>
+          <w:lang w:val="en-US"/>
+        </w:rPr>
+        <w:t>Grey :</w:t>
+      </w:r>
+      <w:proofErr w:type="gramEnd"/>
+      <w:r>
+        <w:rPr>
+          <w:lang w:val="en-US"/>
+        </w:rPr>
+        <w:t xml:space="preserve"> </w:t>
+      </w:r>
+      <w:hyperlink r:id="rId57" w:history="1">
+        <w:r>
+          <w:rPr>
+            <w:rStyle w:val="Hyperlink"/>
+            <w:lang w:val="en-US"/>
+          </w:rPr>
+          <w:t>https://london-tea.ch/products/earl-grey-tea-bio-nr-404?variant=40542086332603</w:t>
+        </w:r>
+      </w:hyperlink>
+    </w:p>
+    <w:p>
+      <w:pPr>
+        <w:pStyle w:val="Listenabsatz"/>
+        <w:numPr>
+          <w:ilvl w:val="0"/>
+          <w:numId w:val="1"/>
+        </w:numPr>
+        <w:rPr>
+          <w:lang w:val="en-US"/>
+        </w:rPr>
+      </w:pPr>
+      <w:r>
+        <w:rPr>
+          <w:lang w:val="en-US"/>
+        </w:rPr>
+        <w:t xml:space="preserve">English Breakfast: </w:t>
+      </w:r>
+      <w:hyperlink r:id="rId58" w:history="1">
+        <w:r>
+          <w:rPr>
+            <w:rStyle w:val="Hyperlink"/>
+            <w:lang w:val="en-US"/>
+          </w:rPr>
+          <w:t>https://london-tea.ch/products/english-breakfast-tea-bio-nr-403?variant=40170502291643</w:t>
+        </w:r>
+      </w:hyperlink>
+    </w:p>
+    <w:p>
+      <w:pPr>
+        <w:pStyle w:val="Listenabsatz"/>
+        <w:numPr>
+          <w:ilvl w:val="0"/>
+          <w:numId w:val="1"/>
+        </w:numPr>
+      </w:pPr>
+      <w:r>
+        <w:t xml:space="preserve">Egg Sandwich: </w:t>
+      </w:r>
+      <w:hyperlink r:id="rId59" w:history="1">
+        <w:r>
+          <w:rPr>
+            <w:rStyle w:val="Hyperlink"/>
+          </w:rPr>
+          <w:t>https://jetzerbegg.ch/shop/sandwich/kloster-sandwich/</w:t>
+        </w:r>
+      </w:hyperlink>
+    </w:p>
+    <w:p>
+      <w:pPr>
+        <w:pStyle w:val="Listenabsatz"/>
+        <w:numPr>
+          <w:ilvl w:val="0"/>
+          <w:numId w:val="1"/>
+        </w:numPr>
+      </w:pPr>
+      <w:proofErr w:type="spellStart"/>
+      <w:r>
+        <w:t>Ham</w:t>
+      </w:r>
+      <w:proofErr w:type="spellEnd"/>
+      <w:r>
+        <w:t xml:space="preserve"> Sandwich: </w:t>
+      </w:r>
+      <w:hyperlink r:id="rId60" w:history="1">
+        <w:r>
+          <w:rPr>
+            <w:rStyle w:val="Hyperlink"/>
+          </w:rPr>
+          <w:t>https://jetzerbegg.ch/shop/neuheiten/pastrami-sandwich/</w:t>
+        </w:r>
+      </w:hyperlink>
+    </w:p>
+    <w:p>
+      <w:pPr>
+        <w:pStyle w:val="Listenabsatz"/>
+        <w:numPr>
+          <w:ilvl w:val="0"/>
+          <w:numId w:val="1"/>
+        </w:numPr>
+        <w:rPr>
+          <w:lang w:val="en-US"/>
+        </w:rPr>
+      </w:pPr>
+      <w:r>
+        <w:rPr>
+          <w:lang w:val="en-US"/>
+        </w:rPr>
+        <w:t xml:space="preserve">Ikea Glass: </w:t>
+      </w:r>
+      <w:hyperlink r:id="rId61" w:history="1">
+        <w:r>
+          <w:rPr>
+            <w:rStyle w:val="Hyperlink"/>
+            <w:lang w:val="en-US"/>
+          </w:rPr>
+          <w:t>https://www.ikea.com/ch/de/p/pokal-glas-hellblau-20574016/</w:t>
+        </w:r>
+      </w:hyperlink>
+    </w:p>
+    <w:p>
+      <w:pPr>
+        <w:pStyle w:val="Listenabsatz"/>
+        <w:numPr>
+          <w:ilvl w:val="0"/>
+          <w:numId w:val="1"/>
+        </w:numPr>
+      </w:pPr>
+      <w:proofErr w:type="spellStart"/>
+      <w:r>
+        <w:t>Linzerli</w:t>
+      </w:r>
+      <w:proofErr w:type="spellEnd"/>
+      <w:r>
+        <w:t xml:space="preserve">: </w:t>
+      </w:r>
+      <w:hyperlink r:id="rId62" w:history="1">
+        <w:r>
+          <w:rPr>
+            <w:rStyle w:val="Hyperlink"/>
+          </w:rPr>
+          <w:t>https://jetzerbegg.ch/shop/suessgebaeck/linzer-gross-20cm/</w:t>
+        </w:r>
+      </w:hyperlink>
+    </w:p>
+    <w:p>
+      <w:pPr>
+        <w:pStyle w:val="Listenabsatz"/>
+        <w:numPr>
+          <w:ilvl w:val="0"/>
+          <w:numId w:val="1"/>
+        </w:numPr>
+        <w:rPr>
+          <w:lang w:val="en-US"/>
+        </w:rPr>
+      </w:pPr>
+      <w:r>
+        <w:rPr>
+          <w:lang w:val="en-US"/>
+        </w:rPr>
+        <w:t xml:space="preserve">Ramseier Logo: </w:t>
+      </w:r>
+      <w:hyperlink r:id="rId63" w:history="1">
+        <w:r>
+          <w:rPr>
+            <w:rStyle w:val="Hyperlink"/>
+            <w:lang w:val="en-US"/>
+          </w:rPr>
+          <w:t>https://adank.ch/lieferanten/ramseier/</w:t>
+        </w:r>
+      </w:hyperlink>
+    </w:p>
+    <w:p>
+      <w:pPr>
+        <w:pStyle w:val="Listenabsatz"/>
+        <w:numPr>
+          <w:ilvl w:val="0"/>
+          <w:numId w:val="1"/>
+        </w:numPr>
+        <w:rPr>
+          <w:lang w:val="en-US"/>
+        </w:rPr>
+      </w:pPr>
+      <w:r>
+        <w:rPr>
+          <w:lang w:val="en-US"/>
+        </w:rPr>
+        <w:lastRenderedPageBreak/>
+        <w:t xml:space="preserve">Mango Chutney Sandwich: </w:t>
+      </w:r>
+      <w:hyperlink r:id="rId64" w:history="1">
+        <w:r>
+          <w:rPr>
+            <w:rStyle w:val="Hyperlink"/>
+            <w:lang w:val="en-US"/>
+          </w:rPr>
+          <w:t>https://jetzerbegg.ch/shop/neuheiten/mangochutney-sandwich/</w:t>
+        </w:r>
+      </w:hyperlink>
+    </w:p>
+    <w:p>
+      <w:pPr>
+        <w:pStyle w:val="Listenabsatz"/>
+        <w:numPr>
+          <w:ilvl w:val="0"/>
+          <w:numId w:val="1"/>
+        </w:numPr>
+        <w:rPr>
+          <w:lang w:val="fr-CH"/>
+        </w:rPr>
+      </w:pPr>
+      <w:proofErr w:type="spellStart"/>
+      <w:proofErr w:type="gramStart"/>
+      <w:r>
+        <w:rPr>
+          <w:lang w:val="fr-CH"/>
+        </w:rPr>
+        <w:t>Multivitamin</w:t>
+      </w:r>
+      <w:proofErr w:type="spellEnd"/>
+      <w:r>
+        <w:rPr>
+          <w:lang w:val="fr-CH"/>
+        </w:rPr>
+        <w:t>:</w:t>
+      </w:r>
+      <w:proofErr w:type="gramEnd"/>
+      <w:r>
+        <w:rPr>
+          <w:lang w:val="fr-CH"/>
+        </w:rPr>
+        <w:t xml:space="preserve"> </w:t>
+      </w:r>
+      <w:hyperlink r:id="rId65" w:history="1">
+        <w:r>
+          <w:rPr>
+            <w:rStyle w:val="Hyperlink"/>
+            <w:lang w:val="fr-CH"/>
+          </w:rPr>
+          <w:t>https://migipedia.migros.ch/de/m-classic-multivitamin-122016100000</w:t>
+        </w:r>
+      </w:hyperlink>
+    </w:p>
+    <w:p>
+      <w:pPr>
+        <w:pStyle w:val="Listenabsatz"/>
+        <w:numPr>
+          <w:ilvl w:val="0"/>
+          <w:numId w:val="1"/>
+        </w:numPr>
+        <w:rPr>
+          <w:lang w:val="en-US"/>
+        </w:rPr>
+      </w:pPr>
+      <w:proofErr w:type="spellStart"/>
+      <w:r>
+        <w:rPr>
+          <w:lang w:val="en-US"/>
+        </w:rPr>
+        <w:t>Oatly</w:t>
+      </w:r>
+      <w:proofErr w:type="spellEnd"/>
+      <w:r>
+        <w:rPr>
+          <w:lang w:val="en-US"/>
+        </w:rPr>
+        <w:t xml:space="preserve"> : </w:t>
+      </w:r>
+      <w:hyperlink r:id="rId66" w:history="1">
+        <w:r>
+          <w:rPr>
+            <w:rStyle w:val="Hyperlink"/>
+            <w:lang w:val="en-US"/>
+          </w:rPr>
+          <w:t>https://www.coop.ch/de/lebensmittel/milchprodukte-eier/milch/vegane-alternativen-zu-milchgetraenken/oatly-haferdrink-barista-past/p/7016380</w:t>
+        </w:r>
+      </w:hyperlink>
+    </w:p>
+    <w:p>
+      <w:pPr>
+        <w:pStyle w:val="Listenabsatz"/>
+        <w:numPr>
+          <w:ilvl w:val="0"/>
+          <w:numId w:val="1"/>
+        </w:numPr>
+        <w:rPr>
+          <w:lang w:val="fr-CH"/>
+        </w:rPr>
+      </w:pPr>
+      <w:r>
+        <w:rPr>
+          <w:lang w:val="fr-CH"/>
+        </w:rPr>
+        <w:t xml:space="preserve">Orange </w:t>
+      </w:r>
+      <w:proofErr w:type="gramStart"/>
+      <w:r>
+        <w:rPr>
+          <w:lang w:val="fr-CH"/>
+        </w:rPr>
+        <w:t>Juice:</w:t>
+      </w:r>
+      <w:proofErr w:type="gramEnd"/>
+      <w:r>
+        <w:rPr>
+          <w:lang w:val="fr-CH"/>
+        </w:rPr>
+        <w:t xml:space="preserve"> </w:t>
+      </w:r>
+      <w:hyperlink r:id="rId67" w:history="1">
+        <w:r>
+          <w:rPr>
+            <w:rStyle w:val="Hyperlink"/>
+            <w:lang w:val="fr-CH"/>
+          </w:rPr>
+          <w:t>https://www.countrypure.com/product/ardmore-farms-orange-frozen-carton-6/</w:t>
+        </w:r>
+      </w:hyperlink>
+    </w:p>
+    <w:p>
+      <w:pPr>
+        <w:pStyle w:val="Listenabsatz"/>
+        <w:numPr>
+          <w:ilvl w:val="0"/>
+          <w:numId w:val="1"/>
+        </w:numPr>
+        <w:rPr>
+          <w:lang w:val="fr-CH"/>
+        </w:rPr>
+      </w:pPr>
+      <w:proofErr w:type="spellStart"/>
+      <w:r>
+        <w:rPr>
+          <w:lang w:val="fr-CH"/>
+        </w:rPr>
+        <w:t>Passionfruit</w:t>
+      </w:r>
+      <w:proofErr w:type="spellEnd"/>
+      <w:r>
+        <w:rPr>
+          <w:lang w:val="fr-CH"/>
+        </w:rPr>
+        <w:t xml:space="preserve"> Cake : </w:t>
+      </w:r>
+      <w:hyperlink r:id="rId68" w:history="1">
+        <w:r>
+          <w:rPr>
+            <w:rStyle w:val="Hyperlink"/>
+            <w:lang w:val="fr-CH"/>
+          </w:rPr>
+          <w:t>https://jetzerbegg.ch/shop/torten/torte-passionsfrucht/</w:t>
+        </w:r>
+      </w:hyperlink>
+    </w:p>
+    <w:p>
+      <w:pPr>
+        <w:pStyle w:val="Listenabsatz"/>
+        <w:numPr>
+          <w:ilvl w:val="0"/>
+          <w:numId w:val="1"/>
+        </w:numPr>
+        <w:rPr>
+          <w:lang w:val="en-US"/>
+        </w:rPr>
+      </w:pPr>
+      <w:proofErr w:type="spellStart"/>
+      <w:proofErr w:type="gramStart"/>
+      <w:r>
+        <w:rPr>
+          <w:lang w:val="en-US"/>
+        </w:rPr>
+        <w:t>Sirserli</w:t>
+      </w:r>
+      <w:proofErr w:type="spellEnd"/>
+      <w:r>
+        <w:rPr>
+          <w:lang w:val="en-US"/>
+        </w:rPr>
+        <w:t> :</w:t>
+      </w:r>
+      <w:proofErr w:type="gramEnd"/>
+      <w:r>
+        <w:rPr>
+          <w:lang w:val="en-US"/>
+        </w:rPr>
+        <w:t xml:space="preserve"> </w:t>
+      </w:r>
+      <w:hyperlink r:id="rId69" w:history="1">
+        <w:r>
+          <w:rPr>
+            <w:rStyle w:val="Hyperlink"/>
+            <w:lang w:val="en-US"/>
+          </w:rPr>
+          <w:t>https://jetzerbegg.ch/shop/weggli/silserli/</w:t>
+        </w:r>
+      </w:hyperlink>
+    </w:p>
+    <w:p>
+      <w:pPr>
+        <w:pStyle w:val="Listenabsatz"/>
+        <w:numPr>
+          <w:ilvl w:val="0"/>
+          <w:numId w:val="1"/>
+        </w:numPr>
+      </w:pPr>
+      <w:r>
+        <w:t>S</w:t>
+      </w:r>
+      <w:r>
+        <w:t>p</w:t>
+      </w:r>
+      <w:r>
+        <w:t xml:space="preserve">itzbub: </w:t>
+      </w:r>
+      <w:hyperlink r:id="rId70" w:history="1">
+        <w:r>
+          <w:rPr>
+            <w:rStyle w:val="Hyperlink"/>
+          </w:rPr>
+          <w:t>https://jetzerbegg.ch/shop/suessgebaeck/spitzbub/</w:t>
+        </w:r>
+      </w:hyperlink>
+    </w:p>
+    <w:p>
+      <w:pPr>
+        <w:pStyle w:val="Listenabsatz"/>
+        <w:numPr>
+          <w:ilvl w:val="0"/>
+          <w:numId w:val="1"/>
+        </w:numPr>
+      </w:pPr>
+      <w:r>
+        <w:t xml:space="preserve">Sprite Logo: </w:t>
+      </w:r>
+      <w:hyperlink r:id="rId71" w:history="1">
+        <w:r>
+          <w:rPr>
+            <w:rStyle w:val="Hyperlink"/>
+          </w:rPr>
+          <w:t>https://www.drink-shop.ch/de/soft-drinks/7885/sprite-lemon-lime-kiste-24-x-330-ml-daenemark</w:t>
+        </w:r>
+      </w:hyperlink>
+    </w:p>
+    <w:p>
+      <w:pPr>
+        <w:pStyle w:val="Listenabsatz"/>
+        <w:numPr>
+          <w:ilvl w:val="0"/>
+          <w:numId w:val="1"/>
+        </w:numPr>
+      </w:pPr>
+      <w:r>
+        <w:t xml:space="preserve">Ueli Bier Stange: </w:t>
+      </w:r>
+      <w:hyperlink r:id="rId72" w:history="1">
+        <w:r>
+          <w:rPr>
+            <w:rStyle w:val="Hyperlink"/>
+          </w:rPr>
+          <w:t>https://ullrich.ch/brauerei-fischerstube-ueli-bier-monaco-glas-30cl/54525/</w:t>
+        </w:r>
+      </w:hyperlink>
+    </w:p>
+    <w:p>
+      <w:pPr>
+        <w:pStyle w:val="Listenabsatz"/>
+        <w:numPr>
+          <w:ilvl w:val="0"/>
+          <w:numId w:val="1"/>
+        </w:numPr>
+        <w:rPr>
+          <w:lang w:val="en-US"/>
+        </w:rPr>
+      </w:pPr>
+      <w:r>
+        <w:rPr>
+          <w:lang w:val="en-US"/>
+        </w:rPr>
+        <w:t xml:space="preserve">Stove: </w:t>
+      </w:r>
+      <w:hyperlink r:id="rId73" w:history="1">
+        <w:r>
+          <w:rPr>
+            <w:rStyle w:val="Hyperlink"/>
+            <w:lang w:val="en-US"/>
+          </w:rPr>
+          <w:t>https://www.plessers.com/jenn-air/jgc1430ads</w:t>
+        </w:r>
+      </w:hyperlink>
+    </w:p>
+    <w:p>
+      <w:pPr>
+        <w:pStyle w:val="Listenabsatz"/>
+        <w:numPr>
+          <w:ilvl w:val="0"/>
+          <w:numId w:val="1"/>
+        </w:numPr>
+        <w:rPr>
+          <w:lang w:val="en-US"/>
+        </w:rPr>
+      </w:pPr>
+      <w:r>
+        <w:rPr>
+          <w:lang w:val="en-US"/>
+        </w:rPr>
+        <w:t xml:space="preserve">Tomato Sandwich: </w:t>
+      </w:r>
+      <w:hyperlink r:id="rId74" w:history="1">
+        <w:r>
+          <w:rPr>
+            <w:rStyle w:val="Hyperlink"/>
+            <w:lang w:val="en-US"/>
+          </w:rPr>
+          <w:t>https://jetzerbegg.ch/shop/sandwich/kloster-sandwichbroetli-mit-tomaten-und-mozzarella/</w:t>
+        </w:r>
+      </w:hyperlink>
+    </w:p>
+    <w:p>
+      <w:pPr>
+        <w:pStyle w:val="Listenabsatz"/>
+        <w:numPr>
+          <w:ilvl w:val="0"/>
+          <w:numId w:val="1"/>
+        </w:numPr>
+      </w:pPr>
+      <w:r>
+        <w:t xml:space="preserve">Tuna Sandwich: </w:t>
+      </w:r>
+      <w:hyperlink r:id="rId75" w:history="1">
+        <w:r>
+          <w:rPr>
+            <w:rStyle w:val="Hyperlink"/>
+          </w:rPr>
+          <w:t>https://jetzerbegg.ch/shop/sandwich/kloster-sandwichbroetli-mit-tomaten-und-mozzarella/</w:t>
+        </w:r>
+      </w:hyperlink>
+    </w:p>
+    <w:p>
+      <w:pPr>
+        <w:pStyle w:val="Listenabsatz"/>
+        <w:numPr>
+          <w:ilvl w:val="0"/>
+          <w:numId w:val="1"/>
+        </w:numPr>
+      </w:pPr>
+      <w:r>
+        <w:t xml:space="preserve">Urdinkelgipfel: </w:t>
+      </w:r>
+      <w:hyperlink r:id="rId76" w:history="1">
+        <w:r>
+          <w:rPr>
+            <w:rStyle w:val="Hyperlink"/>
+          </w:rPr>
+          <w:t>https://jetzerbegg.ch/shop/weggli/urdinkelgipfel/</w:t>
+        </w:r>
+      </w:hyperlink>
+    </w:p>
+    <w:p>
+      <w:pPr>
+        <w:pStyle w:val="Listenabsatz"/>
+        <w:numPr>
+          <w:ilvl w:val="0"/>
+          <w:numId w:val="1"/>
+        </w:numPr>
+        <w:rPr>
+          <w:lang w:val="en-US"/>
+        </w:rPr>
+      </w:pPr>
+      <w:r>
+        <w:rPr>
+          <w:lang w:val="en-US"/>
+        </w:rPr>
+        <w:t xml:space="preserve">Water: </w:t>
+      </w:r>
+      <w:hyperlink r:id="rId77" w:history="1">
+        <w:r>
+          <w:rPr>
+            <w:rStyle w:val="Hyperlink"/>
+            <w:lang w:val="en-US"/>
+          </w:rPr>
+          <w:t>https://encrypted-tbn2.gstatic.com/images?q=tbn:ANd9GcT_OYVCXvPQdjYDDfWm8MCP3GlzDDNz2Pi_oXCFPIBOr8AwGr8N</w:t>
+        </w:r>
+      </w:hyperlink>
+    </w:p>
+    <w:p>
+      <w:pPr>
+        <w:pStyle w:val="Listenabsatz"/>
+        <w:numPr>
+          <w:ilvl w:val="0"/>
+          <w:numId w:val="1"/>
+        </w:numPr>
+      </w:pPr>
+      <w:proofErr w:type="spellStart"/>
+      <w:r>
+        <w:t>Wurstwegge</w:t>
+      </w:r>
+      <w:proofErr w:type="spellEnd"/>
+      <w:r>
+        <w:t xml:space="preserve">: </w:t>
+      </w:r>
+      <w:hyperlink r:id="rId78" w:history="1">
+        <w:r>
+          <w:rPr>
+            <w:rStyle w:val="Hyperlink"/>
+          </w:rPr>
+          <w:t>https://jetzerbegg.ch/shop/neuheiten/wurstwegge/</w:t>
+        </w:r>
+      </w:hyperlink>
+    </w:p>
+    <w:p>
+      <w:pPr>
+        <w:pStyle w:val="Listenabsatz"/>
+        <w:numPr>
+          <w:ilvl w:val="0"/>
+          <w:numId w:val="1"/>
+        </w:numPr>
+        <w:rPr>
+          <w:lang w:val="en-US"/>
+        </w:rPr>
+      </w:pPr>
+      <w:proofErr w:type="spellStart"/>
+      <w:r>
+        <w:rPr>
+          <w:lang w:val="en-US"/>
+        </w:rPr>
+        <w:t>Collalto</w:t>
+      </w:r>
+      <w:proofErr w:type="spellEnd"/>
+      <w:r>
+        <w:rPr>
+          <w:lang w:val="en-US"/>
+        </w:rPr>
+        <w:t xml:space="preserve">: </w:t>
+      </w:r>
+      <w:hyperlink r:id="rId79" w:history="1">
+        <w:r>
+          <w:rPr>
+            <w:rStyle w:val="Hyperlink"/>
+            <w:lang w:val="en-US"/>
+          </w:rPr>
+          <w:t>https://www.flaschenpost.ch/gaio-prosecco-di-conegliano-e-valdobbiadene-extra-dry-collalto-mo_collalto</w:t>
+        </w:r>
+      </w:hyperlink>
+    </w:p>
+    <w:p>
+      <w:pPr>
+        <w:pStyle w:val="Listenabsatz"/>
+        <w:numPr>
+          <w:ilvl w:val="0"/>
+          <w:numId w:val="1"/>
+        </w:numPr>
+        <w:rPr>
+          <w:lang w:val="en-US"/>
+        </w:rPr>
+      </w:pPr>
+      <w:r>
+        <w:rPr>
+          <w:lang w:val="en-US"/>
+        </w:rPr>
+        <w:t xml:space="preserve">Ginger Lemongrass: </w:t>
+      </w:r>
+      <w:hyperlink r:id="rId80" w:history="1">
+        <w:r>
+          <w:rPr>
+            <w:rStyle w:val="Hyperlink"/>
+            <w:lang w:val="en-US"/>
+          </w:rPr>
+          <w:t>https://london-tea.ch/products/ginger-lemongrass-bio-n-474</w:t>
+        </w:r>
+      </w:hyperlink>
+    </w:p>
+    <w:p>
+      <w:pPr>
+        <w:pStyle w:val="Listenabsatz"/>
+        <w:numPr>
+          <w:ilvl w:val="0"/>
+          <w:numId w:val="1"/>
+        </w:numPr>
+        <w:rPr>
+          <w:lang w:val="en-US"/>
+        </w:rPr>
+      </w:pPr>
+      <w:r>
+        <w:rPr>
+          <w:lang w:val="en-US"/>
+        </w:rPr>
+        <w:t xml:space="preserve">Nana Mint: </w:t>
+      </w:r>
+      <w:hyperlink r:id="rId81" w:history="1">
+        <w:r>
+          <w:rPr>
+            <w:rStyle w:val="Hyperlink"/>
+            <w:lang w:val="en-US"/>
+          </w:rPr>
+          <w:t>https://london-tea.ch/products/mentha-nana-bio-nr-462?variant=40542233362619</w:t>
+        </w:r>
+      </w:hyperlink>
+    </w:p>
+    <w:p>
+      <w:pPr>
+        <w:pStyle w:val="Listenabsatz"/>
+        <w:numPr>
+          <w:ilvl w:val="0"/>
+          <w:numId w:val="1"/>
+        </w:numPr>
+        <w:rPr>
+          <w:lang w:val="en-US"/>
+        </w:rPr>
+      </w:pPr>
+      <w:r>
+        <w:rPr>
+          <w:lang w:val="en-US"/>
+        </w:rPr>
+        <w:t xml:space="preserve">Rooibos: </w:t>
+      </w:r>
+      <w:hyperlink r:id="rId82" w:history="1">
+        <w:r>
+          <w:rPr>
+            <w:rStyle w:val="Hyperlink"/>
+            <w:lang w:val="en-US"/>
+          </w:rPr>
+          <w:t>https://london-tea.ch/products/rooibos-boubon-vanilla-bio-nr-450?variant=40542185816251</w:t>
+        </w:r>
+      </w:hyperlink>
+    </w:p>
+    <w:p>
+      <w:pPr>
+        <w:pStyle w:val="Listenabsatz"/>
+        <w:numPr>
+          <w:ilvl w:val="0"/>
+          <w:numId w:val="1"/>
+        </w:numPr>
+      </w:pPr>
+      <w:proofErr w:type="spellStart"/>
+      <w:r>
+        <w:t>Verveine</w:t>
+      </w:r>
+      <w:proofErr w:type="spellEnd"/>
+      <w:r>
+        <w:t xml:space="preserve">: </w:t>
+      </w:r>
+      <w:hyperlink r:id="rId83" w:history="1">
+        <w:r>
+          <w:rPr>
+            <w:rStyle w:val="Hyperlink"/>
+          </w:rPr>
+          <w:t>https://london-tea.ch/products/verveine-eisenkraut-nr-460?variant=40542206591163</w:t>
+        </w:r>
+      </w:hyperlink>
+    </w:p>
+    <w:p>
+      <w:pPr>
+        <w:pStyle w:val="berschrift1"/>
+      </w:pPr>
+      <w:r>
+        <w:t>Sounds:</w:t>
+      </w:r>
+    </w:p>
+    <w:p>
+      <w:pPr>
+        <w:pStyle w:val="Listenabsatz"/>
+        <w:numPr>
+          <w:ilvl w:val="0"/>
+          <w:numId w:val="1"/>
+        </w:numPr>
+        <w:rPr>
+          <w:lang w:val="fr-CH"/>
+        </w:rPr>
+      </w:pPr>
+      <w:r>
+        <w:rPr>
+          <w:lang w:val="fr-CH"/>
+        </w:rPr>
+        <w:t xml:space="preserve">Menu </w:t>
+      </w:r>
+      <w:proofErr w:type="gramStart"/>
+      <w:r>
+        <w:rPr>
+          <w:lang w:val="fr-CH"/>
+        </w:rPr>
+        <w:t>Scroll:</w:t>
+      </w:r>
+      <w:proofErr w:type="gramEnd"/>
+      <w:r>
+        <w:rPr>
+          <w:lang w:val="fr-CH"/>
+        </w:rPr>
+        <w:t xml:space="preserve"> </w:t>
+      </w:r>
+      <w:hyperlink r:id="rId84" w:history="1">
+        <w:r>
+          <w:rPr>
+            <w:rStyle w:val="Hyperlink"/>
+            <w:lang w:val="fr-CH"/>
+          </w:rPr>
+          <w:t>https://pixabay.com/sound-effects/search/menu/</w:t>
+        </w:r>
+      </w:hyperlink>
+    </w:p>
+    <w:p>
+      <w:pPr>
+        <w:pStyle w:val="Listenabsatz"/>
+        <w:numPr>
+          <w:ilvl w:val="0"/>
+          <w:numId w:val="1"/>
+        </w:numPr>
+        <w:rPr>
+          <w:lang w:val="fr-CH"/>
+        </w:rPr>
+      </w:pPr>
+      <w:r>
+        <w:rPr>
+          <w:lang w:val="fr-CH"/>
+        </w:rPr>
+        <w:t xml:space="preserve">Menu </w:t>
+      </w:r>
+      <w:proofErr w:type="spellStart"/>
+      <w:r>
+        <w:rPr>
+          <w:lang w:val="fr-CH"/>
+        </w:rPr>
+        <w:t>Confirm</w:t>
+      </w:r>
+      <w:proofErr w:type="spellEnd"/>
+      <w:r>
+        <w:rPr>
+          <w:lang w:val="fr-CH"/>
+        </w:rPr>
+        <w:t xml:space="preserve"> : </w:t>
+      </w:r>
+      <w:hyperlink r:id="rId85" w:history="1">
+        <w:r>
+          <w:rPr>
+            <w:rStyle w:val="Hyperlink"/>
+            <w:lang w:val="fr-CH"/>
+          </w:rPr>
+          <w:t>https://pixabay.com/sound-effects/search/menu/</w:t>
+        </w:r>
+      </w:hyperlink>
+    </w:p>
+    <w:p>
+      <w:pPr>
+        <w:pStyle w:val="Listenabsatz"/>
+        <w:numPr>
+          <w:ilvl w:val="0"/>
+          <w:numId w:val="1"/>
+        </w:numPr>
+        <w:rPr>
+          <w:lang w:val="en-US"/>
+        </w:rPr>
+      </w:pPr>
+      <w:proofErr w:type="gramStart"/>
+      <w:r>
+        <w:rPr>
+          <w:lang w:val="en-US"/>
+        </w:rPr>
+        <w:t>Footstep :</w:t>
+      </w:r>
+      <w:proofErr w:type="gramEnd"/>
+      <w:r>
+        <w:rPr>
+          <w:lang w:val="en-US"/>
+        </w:rPr>
+        <w:t xml:space="preserve"> </w:t>
+      </w:r>
+      <w:hyperlink r:id="rId86" w:history="1">
+        <w:r>
+          <w:rPr>
+            <w:rStyle w:val="Hyperlink"/>
+            <w:lang w:val="en-US"/>
+          </w:rPr>
+          <w:t>https://pixabay.com/de/sound-effects/search/footstep/</w:t>
+        </w:r>
+      </w:hyperlink>
+    </w:p>
+    <w:p>
+      <w:pPr>
+        <w:pStyle w:val="Listenabsatz"/>
+        <w:numPr>
+          <w:ilvl w:val="0"/>
+          <w:numId w:val="1"/>
+        </w:numPr>
+        <w:rPr>
+          <w:lang w:val="en-US"/>
+        </w:rPr>
+      </w:pPr>
+      <w:r>
+        <w:rPr>
+          <w:lang w:val="en-US"/>
+        </w:rPr>
+        <w:t xml:space="preserve">Pick Up: </w:t>
+      </w:r>
+      <w:hyperlink r:id="rId87" w:history="1">
+        <w:r>
+          <w:rPr>
+            <w:rStyle w:val="Hyperlink"/>
+            <w:lang w:val="en-US"/>
+          </w:rPr>
+          <w:t>https://pixabay.com/de/sound-effects/search/inventar/</w:t>
+        </w:r>
+      </w:hyperlink>
+    </w:p>
+    <w:p>
+      <w:pPr>
+        <w:pStyle w:val="Listenabsatz"/>
+        <w:numPr>
+          <w:ilvl w:val="0"/>
+          <w:numId w:val="1"/>
+        </w:numPr>
+      </w:pPr>
+      <w:r>
+        <w:t xml:space="preserve">Dinner </w:t>
+      </w:r>
+      <w:proofErr w:type="spellStart"/>
+      <w:r>
+        <w:t>Atmosphere</w:t>
+      </w:r>
+      <w:proofErr w:type="spellEnd"/>
+      <w:r>
+        <w:t xml:space="preserve">: </w:t>
+      </w:r>
+      <w:hyperlink r:id="rId88" w:history="1">
+        <w:r>
+          <w:rPr>
+            <w:rStyle w:val="Hyperlink"/>
+          </w:rPr>
+          <w:t>https://pixabay.com/de/sound-effects/search/dinner-plate/</w:t>
+        </w:r>
+      </w:hyperlink>
+    </w:p>
+    <w:p>
+      <w:pPr>
+        <w:pStyle w:val="Listenabsatz"/>
+        <w:numPr>
+          <w:ilvl w:val="0"/>
+          <w:numId w:val="1"/>
+        </w:numPr>
+        <w:rPr>
+          <w:lang w:val="en-US"/>
+        </w:rPr>
+      </w:pPr>
+      <w:r>
+        <w:rPr>
+          <w:lang w:val="en-US"/>
+        </w:rPr>
+        <w:t xml:space="preserve">Put Down: </w:t>
+      </w:r>
+      <w:hyperlink r:id="rId89" w:history="1">
+        <w:r>
+          <w:rPr>
+            <w:rStyle w:val="Hyperlink"/>
+            <w:lang w:val="en-US"/>
+          </w:rPr>
+          <w:t>https://freesoundstock.com/products/put-plate-on-table-sound-effect?utm_source=youtube&amp;utm_medium=product_shelf</w:t>
+        </w:r>
+      </w:hyperlink>
+    </w:p>
+    <w:p>
+      <w:pPr>
+        <w:pStyle w:val="Listenabsatz"/>
+        <w:numPr>
+          <w:ilvl w:val="0"/>
+          <w:numId w:val="1"/>
+        </w:numPr>
+        <w:rPr>
+          <w:lang w:val="en-US"/>
+        </w:rPr>
+      </w:pPr>
+      <w:r>
+        <w:rPr>
+          <w:lang w:val="en-US"/>
+        </w:rPr>
+        <w:t xml:space="preserve">Music Loop: </w:t>
+      </w:r>
+      <w:hyperlink r:id="rId90" w:history="1">
+        <w:r>
+          <w:rPr>
+            <w:rStyle w:val="Hyperlink"/>
+            <w:lang w:val="en-US"/>
+          </w:rPr>
+          <w:t>https://www.zapsplat.com/music/easy-cheesy-fun-up-tempo-funky-retro-action-arcade-game-music-great-for-menu-or-pause-sections/</w:t>
+        </w:r>
+      </w:hyperlink>
+    </w:p>
+    <w:p>
+      <w:pPr>
+        <w:pStyle w:val="Listenabsatz"/>
+        <w:numPr>
+          <w:ilvl w:val="0"/>
+          <w:numId w:val="1"/>
+        </w:numPr>
+        <w:rPr>
+          <w:lang w:val="en-US"/>
+        </w:rPr>
+      </w:pPr>
+      <w:r>
+        <w:rPr>
+          <w:lang w:val="en-US"/>
+        </w:rPr>
+        <w:t xml:space="preserve">Coffee Machine: </w:t>
+      </w:r>
+      <w:hyperlink r:id="rId91" w:history="1">
+        <w:r>
+          <w:rPr>
+            <w:rStyle w:val="Hyperlink"/>
+            <w:lang w:val="en-US"/>
+          </w:rPr>
+          <w:t>https://pixabay.com/de/sound-effects/search/coffee-maker/</w:t>
+        </w:r>
+      </w:hyperlink>
+    </w:p>
+    <w:p>
+      <w:pPr>
+        <w:pStyle w:val="Listenabsatz"/>
+        <w:numPr>
+          <w:ilvl w:val="0"/>
+          <w:numId w:val="1"/>
+        </w:numPr>
+        <w:rPr>
+          <w:lang w:val="en-US"/>
+        </w:rPr>
+      </w:pPr>
+      <w:r>
+        <w:rPr>
+          <w:lang w:val="en-US"/>
+        </w:rPr>
+        <w:t xml:space="preserve">Water Pouring: </w:t>
+      </w:r>
+      <w:hyperlink r:id="rId92" w:history="1">
+        <w:r>
+          <w:rPr>
+            <w:rStyle w:val="Hyperlink"/>
+            <w:lang w:val="en-US"/>
+          </w:rPr>
+          <w:t>https://pixabay.com/de/sound-effects/search/pouring/</w:t>
+        </w:r>
+      </w:hyperlink>
+    </w:p>
+    <w:p>
+      <w:pPr>
+        <w:pStyle w:val="Listenabsatz"/>
+        <w:numPr>
+          <w:ilvl w:val="0"/>
+          <w:numId w:val="1"/>
+        </w:numPr>
+        <w:rPr>
+          <w:lang w:val="en-US"/>
+        </w:rPr>
+      </w:pPr>
+      <w:r>
+        <w:rPr>
+          <w:lang w:val="en-US"/>
+        </w:rPr>
+        <w:t xml:space="preserve">Open Drawer: </w:t>
+      </w:r>
+      <w:hyperlink r:id="rId93" w:history="1">
+        <w:r>
+          <w:rPr>
+            <w:rStyle w:val="Hyperlink"/>
+            <w:lang w:val="en-US"/>
+          </w:rPr>
+          <w:t>https://pixabay.com/de/sound-effects/search/drawer/</w:t>
+        </w:r>
+      </w:hyperlink>
+    </w:p>
+    <w:p>
+      <w:pPr>
+        <w:pStyle w:val="Listenabsatz"/>
+        <w:numPr>
+          <w:ilvl w:val="0"/>
+          <w:numId w:val="1"/>
+        </w:numPr>
+        <w:rPr>
+          <w:lang w:val="en-US"/>
+        </w:rPr>
+      </w:pPr>
+      <w:r>
+        <w:rPr>
+          <w:lang w:val="en-US"/>
+        </w:rPr>
+        <w:t xml:space="preserve">Closing Drawer: </w:t>
+      </w:r>
+      <w:hyperlink r:id="rId94" w:history="1">
+        <w:r>
+          <w:rPr>
+            <w:rStyle w:val="Hyperlink"/>
+            <w:lang w:val="en-US"/>
+          </w:rPr>
+          <w:t>https://pixabay.com/de/sound-effects/search/drawer-closing/</w:t>
+        </w:r>
+      </w:hyperlink>
+    </w:p>
+    <w:p>
+      <w:pPr>
+        <w:pStyle w:val="Listenabsatz"/>
+        <w:numPr>
+          <w:ilvl w:val="0"/>
+          <w:numId w:val="1"/>
+        </w:numPr>
+        <w:rPr>
+          <w:lang w:val="fr-CH"/>
+        </w:rPr>
+      </w:pPr>
+      <w:proofErr w:type="gramStart"/>
+      <w:r>
+        <w:rPr>
+          <w:lang w:val="fr-CH"/>
+        </w:rPr>
+        <w:t>Mixer:</w:t>
+      </w:r>
+      <w:proofErr w:type="gramEnd"/>
+      <w:r>
+        <w:rPr>
+          <w:lang w:val="fr-CH"/>
+        </w:rPr>
+        <w:t xml:space="preserve"> </w:t>
+      </w:r>
+      <w:hyperlink r:id="rId95" w:history="1">
+        <w:r>
+          <w:rPr>
+            <w:rStyle w:val="Hyperlink"/>
+            <w:lang w:val="fr-CH"/>
+          </w:rPr>
+          <w:t>https://pixabay.com/de/sound-effects/search/mixer/</w:t>
+        </w:r>
+      </w:hyperlink>
+    </w:p>
+    <w:p>
+      <w:pPr>
+        <w:pStyle w:val="Listenabsatz"/>
+        <w:numPr>
+          <w:ilvl w:val="0"/>
+          <w:numId w:val="1"/>
+        </w:numPr>
+        <w:rPr>
+          <w:lang w:val="fr-CH"/>
         </w:rPr>
       </w:pPr>
     </w:p>
@@ -169,6 +2834,126 @@
     </w:sectPr>
   </w:body>
 </w:document>
+</file>
+
+<file path=word/numbering.xml><?xml version="1.0" encoding="utf-8"?>
+<w:numbering xmlns:wpc="http://schemas.microsoft.com/office/word/2010/wordprocessingCanvas" xmlns:cx="http://schemas.microsoft.com/office/drawing/2014/chartex" xmlns:cx1="http://schemas.microsoft.com/office/drawing/2015/9/8/chartex" xmlns:cx2="http://schemas.microsoft.com/office/drawing/2015/10/21/chartex" xmlns:cx3="http://schemas.microsoft.com/office/drawing/2016/5/9/chartex" xmlns:cx4="http://schemas.microsoft.com/office/drawing/2016/5/10/chartex" xmlns:cx5="http://schemas.microsoft.com/office/drawing/2016/5/11/chartex" xmlns:cx6="http://schemas.microsoft.com/office/drawing/2016/5/12/chartex" xmlns:cx7="http://schemas.microsoft.com/office/drawing/2016/5/13/chartex" xmlns:cx8="http://schemas.microsoft.com/office/drawing/2016/5/14/chartex" xmlns:mc="http://schemas.openxmlformats.org/markup-compatibility/2006" xmlns:aink="http://schemas.microsoft.com/office/drawing/2016/ink" xmlns:am3d="http://schemas.microsoft.com/office/drawing/2017/model3d" xmlns:o="urn:schemas-microsoft-com:office:office" xmlns:oel="http://schemas.microsoft.com/office/2019/extlst" xmlns:r="http://schemas.openxmlformats.org/officeDocument/2006/relationships" xmlns:m="http://schemas.openxmlformats.org/officeDocument/2006/math" xmlns:v="urn:schemas-microsoft-com:vml" xmlns:wp14="http://schemas.microsoft.com/office/word/2010/wordprocessingDrawing" xmlns:wp="http://schemas.openxmlformats.org/drawingml/2006/wordprocessingDrawing" xmlns:w10="urn:schemas-microsoft-com:office:word" xmlns:w="http://schemas.openxmlformats.org/wordprocessingml/2006/main" xmlns:w14="http://schemas.microsoft.com/office/word/2010/wordml" xmlns:w15="http://schemas.microsoft.com/office/word/2012/wordml" xmlns:w16cex="http://schemas.microsoft.com/office/word/2018/wordml/cex" xmlns:w16cid="http://schemas.microsoft.com/office/word/2016/wordml/cid" xmlns:w16="http://schemas.microsoft.com/office/word/2018/wordml" xmlns:w16du="http://schemas.microsoft.com/office/word/2023/wordml/word16du" xmlns:w16sdtdh="http://schemas.microsoft.com/office/word/2020/wordml/sdtdatahash" xmlns:w16se="http://schemas.microsoft.com/office/word/2015/wordml/symex" xmlns:wpg="http://schemas.microsoft.com/office/word/2010/wordprocessingGroup" xmlns:wpi="http://schemas.microsoft.com/office/word/2010/wordprocessingInk" xmlns:wne="http://schemas.microsoft.com/office/word/2006/wordml" xmlns:wps="http://schemas.microsoft.com/office/word/2010/wordprocessingShape" mc:Ignorable="w14 w15 w16se w16cid w16 w16cex w16sdtdh w16du wp14">
+  <w:abstractNum w:abstractNumId="0" w15:restartNumberingAfterBreak="0">
+    <w:nsid w:val="1693317A"/>
+    <w:multiLevelType w:val="hybridMultilevel"/>
+    <w:tmpl w:val="B13E3BFC"/>
+    <w:lvl w:ilvl="0" w:tplc="2DE869D6">
+      <w:numFmt w:val="bullet"/>
+      <w:lvlText w:val="-"/>
+      <w:lvlJc w:val="left"/>
+      <w:pPr>
+        <w:ind w:left="720" w:hanging="360"/>
+      </w:pPr>
+      <w:rPr>
+        <w:rFonts w:ascii="Calibri" w:eastAsiaTheme="minorHAnsi" w:hAnsi="Calibri" w:cs="Calibri" w:hint="default"/>
+      </w:rPr>
+    </w:lvl>
+    <w:lvl w:ilvl="1" w:tplc="08070003" w:tentative="1">
+      <w:start w:val="1"/>
+      <w:numFmt w:val="bullet"/>
+      <w:lvlText w:val="o"/>
+      <w:lvlJc w:val="left"/>
+      <w:pPr>
+        <w:ind w:left="1440" w:hanging="360"/>
+      </w:pPr>
+      <w:rPr>
+        <w:rFonts w:ascii="Courier New" w:hAnsi="Courier New" w:cs="Courier New" w:hint="default"/>
+      </w:rPr>
+    </w:lvl>
+    <w:lvl w:ilvl="2" w:tplc="08070005" w:tentative="1">
+      <w:start w:val="1"/>
+      <w:numFmt w:val="bullet"/>
+      <w:lvlText w:val=""/>
+      <w:lvlJc w:val="left"/>
+      <w:pPr>
+        <w:ind w:left="2160" w:hanging="360"/>
+      </w:pPr>
+      <w:rPr>
+        <w:rFonts w:ascii="Wingdings" w:hAnsi="Wingdings" w:hint="default"/>
+      </w:rPr>
+    </w:lvl>
+    <w:lvl w:ilvl="3" w:tplc="08070001" w:tentative="1">
+      <w:start w:val="1"/>
+      <w:numFmt w:val="bullet"/>
+      <w:lvlText w:val=""/>
+      <w:lvlJc w:val="left"/>
+      <w:pPr>
+        <w:ind w:left="2880" w:hanging="360"/>
+      </w:pPr>
+      <w:rPr>
+        <w:rFonts w:ascii="Symbol" w:hAnsi="Symbol" w:hint="default"/>
+      </w:rPr>
+    </w:lvl>
+    <w:lvl w:ilvl="4" w:tplc="08070003" w:tentative="1">
+      <w:start w:val="1"/>
+      <w:numFmt w:val="bullet"/>
+      <w:lvlText w:val="o"/>
+      <w:lvlJc w:val="left"/>
+      <w:pPr>
+        <w:ind w:left="3600" w:hanging="360"/>
+      </w:pPr>
+      <w:rPr>
+        <w:rFonts w:ascii="Courier New" w:hAnsi="Courier New" w:cs="Courier New" w:hint="default"/>
+      </w:rPr>
+    </w:lvl>
+    <w:lvl w:ilvl="5" w:tplc="08070005" w:tentative="1">
+      <w:start w:val="1"/>
+      <w:numFmt w:val="bullet"/>
+      <w:lvlText w:val=""/>
+      <w:lvlJc w:val="left"/>
+      <w:pPr>
+        <w:ind w:left="4320" w:hanging="360"/>
+      </w:pPr>
+      <w:rPr>
+        <w:rFonts w:ascii="Wingdings" w:hAnsi="Wingdings" w:hint="default"/>
+      </w:rPr>
+    </w:lvl>
+    <w:lvl w:ilvl="6" w:tplc="08070001" w:tentative="1">
+      <w:start w:val="1"/>
+      <w:numFmt w:val="bullet"/>
+      <w:lvlText w:val=""/>
+      <w:lvlJc w:val="left"/>
+      <w:pPr>
+        <w:ind w:left="5040" w:hanging="360"/>
+      </w:pPr>
+      <w:rPr>
+        <w:rFonts w:ascii="Symbol" w:hAnsi="Symbol" w:hint="default"/>
+      </w:rPr>
+    </w:lvl>
+    <w:lvl w:ilvl="7" w:tplc="08070003" w:tentative="1">
+      <w:start w:val="1"/>
+      <w:numFmt w:val="bullet"/>
+      <w:lvlText w:val="o"/>
+      <w:lvlJc w:val="left"/>
+      <w:pPr>
+        <w:ind w:left="5760" w:hanging="360"/>
+      </w:pPr>
+      <w:rPr>
+        <w:rFonts w:ascii="Courier New" w:hAnsi="Courier New" w:cs="Courier New" w:hint="default"/>
+      </w:rPr>
+    </w:lvl>
+    <w:lvl w:ilvl="8" w:tplc="08070005" w:tentative="1">
+      <w:start w:val="1"/>
+      <w:numFmt w:val="bullet"/>
+      <w:lvlText w:val=""/>
+      <w:lvlJc w:val="left"/>
+      <w:pPr>
+        <w:ind w:left="6480" w:hanging="360"/>
+      </w:pPr>
+      <w:rPr>
+        <w:rFonts w:ascii="Wingdings" w:hAnsi="Wingdings" w:hint="default"/>
+      </w:rPr>
+    </w:lvl>
+  </w:abstractNum>
+  <w:num w:numId="1" w16cid:durableId="614144665">
+    <w:abstractNumId w:val="0"/>
+  </w:num>
+</w:numbering>
 </file>
 
 <file path=word/styles.xml><?xml version="1.0" encoding="utf-8"?>
@@ -656,6 +3441,29 @@
       <w:szCs w:val="32"/>
     </w:rPr>
   </w:style>
+  <w:style w:type="paragraph" w:styleId="Listenabsatz">
+    <w:name w:val="List Paragraph"/>
+    <w:basedOn w:val="Standard"/>
+    <w:uiPriority w:val="34"/>
+    <w:qFormat/>
+    <w:rsid w:val="00BE74FD"/>
+    <w:pPr>
+      <w:ind w:left="720"/>
+      <w:contextualSpacing/>
+    </w:pPr>
+  </w:style>
+  <w:style w:type="character" w:styleId="BesuchterLink">
+    <w:name w:val="FollowedHyperlink"/>
+    <w:basedOn w:val="Absatz-Standardschriftart"/>
+    <w:uiPriority w:val="99"/>
+    <w:semiHidden/>
+    <w:unhideWhenUsed/>
+    <w:rsid w:val="00573403"/>
+    <w:rPr>
+      <w:color w:val="954F72" w:themeColor="followedHyperlink"/>
+      <w:u w:val="single"/>
+    </w:rPr>
+  </w:style>
 </w:styles>
 </file>
 

</xml_diff>